<commit_message>
Convert opcode handlers to OpcodeHandler base with PatchLevel constructor injection. Add SetBusState to detach the dispatch from PacketBus on demand.  Still a singleton.
</commit_message>
<xml_diff>
--- a/Glass/Doc/Patch Instructions.docx
+++ b/Glass/Doc/Patch Instructions.docx
@@ -6,11 +6,9 @@
       <w:pPr>
         <w:pStyle w:val="Heading1"/>
       </w:pPr>
-      <w:proofErr w:type="spellStart"/>
       <w:r>
         <w:t>OP_NpcMoveUpdate</w:t>
       </w:r>
-      <w:proofErr w:type="spellEnd"/>
     </w:p>
     <w:p>
       <w:pPr>
@@ -93,66 +91,10 @@
           <w:b/>
           <w:bCs/>
         </w:rPr>
-        <w:t xml:space="preserve">Disambiguation from </w:t>
-      </w:r>
-      <w:proofErr w:type="spellStart"/>
-      <w:r>
-        <w:rPr>
-          <w:b/>
-          <w:bCs/>
-        </w:rPr>
-        <w:t>OP_MobUpdate</w:t>
-      </w:r>
-      <w:proofErr w:type="spellEnd"/>
-      <w:r>
-        <w:rPr>
-          <w:b/>
-          <w:bCs/>
-        </w:rPr>
-        <w:t>.</w:t>
-      </w:r>
-      <w:r>
-        <w:t xml:space="preserve"> </w:t>
-      </w:r>
-      <w:proofErr w:type="spellStart"/>
-      <w:r>
-        <w:t>NpcMoveUpdate</w:t>
-      </w:r>
-      <w:proofErr w:type="spellEnd"/>
-      <w:r>
-        <w:t xml:space="preserve"> has </w:t>
-      </w:r>
-      <w:proofErr w:type="gramStart"/>
-      <w:r>
-        <w:t>the</w:t>
-      </w:r>
-      <w:proofErr w:type="gramEnd"/>
-      <w:r>
-        <w:t xml:space="preserve"> larger base size and </w:t>
-      </w:r>
-      <w:proofErr w:type="gramStart"/>
-      <w:r>
-        <w:t>the</w:t>
-      </w:r>
-      <w:proofErr w:type="gramEnd"/>
-      <w:r>
-        <w:t xml:space="preserve"> optional-field tail. </w:t>
-      </w:r>
-      <w:proofErr w:type="spellStart"/>
-      <w:r>
-        <w:t>MobUpdate</w:t>
-      </w:r>
-      <w:proofErr w:type="spellEnd"/>
-      <w:r>
-        <w:t xml:space="preserve"> is </w:t>
-      </w:r>
-      <w:proofErr w:type="gramStart"/>
-      <w:r>
-        <w:t>fixed-shape</w:t>
-      </w:r>
-      <w:proofErr w:type="gramEnd"/>
-      <w:r>
-        <w:t xml:space="preserve"> and smaller.</w:t>
+        <w:t>Disambiguation from OP_MobUpdate.</w:t>
+      </w:r>
+      <w:r>
+        <w:t xml:space="preserve"> NpcMoveUpdate has the larger base size and the optional-field tail. MobUpdate is fixed-shape and smaller.</w:t>
       </w:r>
     </w:p>
     <w:p>
@@ -192,15 +134,7 @@
         </w:numPr>
       </w:pPr>
       <w:r>
-        <w:t xml:space="preserve">Position fields (x, y, </w:t>
-      </w:r>
-      <w:proofErr w:type="gramStart"/>
-      <w:r>
-        <w:t>z) —</w:t>
-      </w:r>
-      <w:proofErr w:type="gramEnd"/>
-      <w:r>
-        <w:t xml:space="preserve"> encoding and per-axis divisors</w:t>
+        <w:t>Position fields (x, y, z) — encoding and per-axis divisors</w:t>
       </w:r>
     </w:p>
     <w:p>
@@ -222,23 +156,7 @@
         </w:numPr>
       </w:pPr>
       <w:r>
-        <w:t>Pitch, velocity, heading delta, dx/</w:t>
-      </w:r>
-      <w:proofErr w:type="spellStart"/>
-      <w:r>
-        <w:t>dy</w:t>
-      </w:r>
-      <w:proofErr w:type="spellEnd"/>
-      <w:r>
-        <w:t>/</w:t>
-      </w:r>
-      <w:proofErr w:type="spellStart"/>
-      <w:r>
-        <w:t>dz</w:t>
-      </w:r>
-      <w:proofErr w:type="spellEnd"/>
-      <w:r>
-        <w:t xml:space="preserve"> — in the optional group</w:t>
+        <w:t>Pitch, velocity, heading delta, dx/dy/dz — in the optional group</w:t>
       </w:r>
     </w:p>
     <w:p>
@@ -273,15 +191,7 @@
         <w:t>Verification technique.</w:t>
       </w:r>
       <w:r>
-        <w:t xml:space="preserve"> Capture a session with mobs visible. Decode consecutive </w:t>
-      </w:r>
-      <w:proofErr w:type="spellStart"/>
-      <w:r>
-        <w:t>NpcMoveUpdate</w:t>
-      </w:r>
-      <w:proofErr w:type="spellEnd"/>
-      <w:r>
-        <w:t xml:space="preserve"> packets for the same spawn ID. Positions should advance continuously, not scatter. If positions look sensible, base layout is intact. If positions scatter, a coordinate field has shifted.</w:t>
+        <w:t xml:space="preserve"> Capture a session with mobs visible. Decode consecutive NpcMoveUpdate packets for the same spawn ID. Positions should advance continuously, not scatter. If positions look sensible, base layout is intact. If positions scatter, a coordinate field has shifted.</w:t>
       </w:r>
     </w:p>
     <w:p>
@@ -345,15 +255,7 @@
         </w:numPr>
       </w:pPr>
       <w:r>
-        <w:t xml:space="preserve">Pick a spawn observable in-game. Capture a sequence of </w:t>
-      </w:r>
-      <w:proofErr w:type="spellStart"/>
-      <w:r>
-        <w:t>NpcMoveUpdate</w:t>
-      </w:r>
-      <w:proofErr w:type="spellEnd"/>
-      <w:r>
-        <w:t xml:space="preserve"> packets for that spawn ID.</w:t>
+        <w:t>Pick a spawn observable in-game. Capture a sequence of NpcMoveUpdate packets for that spawn ID.</w:t>
       </w:r>
     </w:p>
     <w:p>
@@ -419,31 +321,7 @@
         <w:t>Spawn ID byte order</w:t>
       </w:r>
       <w:r>
-        <w:t xml:space="preserve"> differs from </w:t>
-      </w:r>
-      <w:proofErr w:type="spellStart"/>
-      <w:r>
-        <w:t>OP_MobUpdate</w:t>
-      </w:r>
-      <w:proofErr w:type="spellEnd"/>
-      <w:r>
-        <w:t xml:space="preserve"> and </w:t>
-      </w:r>
-      <w:proofErr w:type="spellStart"/>
-      <w:r>
-        <w:t>OP_ZoneEntry</w:t>
-      </w:r>
-      <w:proofErr w:type="spellEnd"/>
-      <w:r>
-        <w:t xml:space="preserve">. </w:t>
-      </w:r>
-      <w:proofErr w:type="spellStart"/>
-      <w:r>
-        <w:t>NpcMoveUpdate</w:t>
-      </w:r>
-      <w:proofErr w:type="spellEnd"/>
-      <w:r>
-        <w:t xml:space="preserve"> reports byte-swapped IDs. Stable for several patches but worth re-confirming.</w:t>
+        <w:t xml:space="preserve"> differs from OP_MobUpdate and OP_ZoneEntry. NpcMoveUpdate reports byte-swapped IDs. Stable for several patches but worth re-confirming.</w:t>
       </w:r>
     </w:p>
     <w:p>
@@ -481,15 +359,7 @@
     </w:p>
     <w:p>
       <w:r>
-        <w:t xml:space="preserve">None for identification. For verifying field contents (spawn ID cross-check), having identified </w:t>
-      </w:r>
-      <w:proofErr w:type="spellStart"/>
-      <w:r>
-        <w:t>OP_ZoneEntry</w:t>
-      </w:r>
-      <w:proofErr w:type="spellEnd"/>
-      <w:r>
-        <w:t xml:space="preserve"> first helps but is not required.</w:t>
+        <w:t>None for identification. For verifying field contents (spawn ID cross-check), having identified OP_ZoneEntry first helps but is not required.</w:t>
       </w:r>
     </w:p>
     <w:p>
@@ -518,12 +388,10 @@
       <w:pPr>
         <w:pStyle w:val="Heading1"/>
       </w:pPr>
-      <w:proofErr w:type="spellStart"/>
       <w:r>
         <w:lastRenderedPageBreak/>
         <w:t>OP_MobUpdate</w:t>
       </w:r>
-      <w:proofErr w:type="spellEnd"/>
     </w:p>
     <w:p>
       <w:pPr>
@@ -535,23 +403,7 @@
     </w:p>
     <w:p>
       <w:r>
-        <w:t xml:space="preserve">Periodic mob position snapshot. Sent by the zone server as an authoritative correction to dead-reckoning positions clients maintain from </w:t>
-      </w:r>
-      <w:proofErr w:type="spellStart"/>
-      <w:r>
-        <w:t>NpcMoveUpdate</w:t>
-      </w:r>
-      <w:proofErr w:type="spellEnd"/>
-      <w:r>
-        <w:t xml:space="preserve">. Lower frequency than </w:t>
-      </w:r>
-      <w:proofErr w:type="spellStart"/>
-      <w:r>
-        <w:t>NpcMoveUpdate</w:t>
-      </w:r>
-      <w:proofErr w:type="spellEnd"/>
-      <w:r>
-        <w:t>, fixed-shape payload.</w:t>
+        <w:t>Periodic mob position snapshot. Sent by the zone server as an authoritative correction to dead-reckoning positions clients maintain from NpcMoveUpdate. Lower frequency than NpcMoveUpdate, fixed-shape payload.</w:t>
       </w:r>
     </w:p>
     <w:p>
@@ -571,23 +423,7 @@
         <w:t>Frequency.</w:t>
       </w:r>
       <w:r>
-        <w:t xml:space="preserve"> Second-highest mob-related opcode after </w:t>
-      </w:r>
-      <w:proofErr w:type="spellStart"/>
-      <w:r>
-        <w:t>NpcMoveUpdate</w:t>
-      </w:r>
-      <w:proofErr w:type="spellEnd"/>
-      <w:r>
-        <w:t xml:space="preserve">. Steady cadence rather than </w:t>
-      </w:r>
-      <w:proofErr w:type="gramStart"/>
-      <w:r>
-        <w:t>event-driven</w:t>
-      </w:r>
-      <w:proofErr w:type="gramEnd"/>
-      <w:r>
-        <w:t>.</w:t>
+        <w:t xml:space="preserve"> Second-highest mob-related opcode after NpcMoveUpdate. Steady cadence rather than event-driven.</w:t>
       </w:r>
     </w:p>
     <w:p>
@@ -626,75 +462,19 @@
         <w:t>Context.</w:t>
       </w:r>
       <w:r>
-        <w:t xml:space="preserve"> Continues firing when mobs are stationary. The complement of </w:t>
-      </w:r>
-      <w:proofErr w:type="spellStart"/>
-      <w:r>
-        <w:t>NpcMoveUpdate's</w:t>
-      </w:r>
-      <w:proofErr w:type="spellEnd"/>
-      <w:r>
-        <w:t xml:space="preserve"> burstiness.</w:t>
-      </w:r>
-    </w:p>
-    <w:p>
-      <w:r>
-        <w:rPr>
-          <w:b/>
-          <w:bCs/>
-        </w:rPr>
-        <w:t xml:space="preserve">Disambiguation from </w:t>
-      </w:r>
-      <w:proofErr w:type="spellStart"/>
-      <w:r>
-        <w:rPr>
-          <w:b/>
-          <w:bCs/>
-        </w:rPr>
-        <w:t>OP_NpcMoveUpdate</w:t>
-      </w:r>
-      <w:proofErr w:type="spellEnd"/>
-      <w:r>
-        <w:rPr>
-          <w:b/>
-          <w:bCs/>
-        </w:rPr>
-        <w:t>.</w:t>
-      </w:r>
-      <w:r>
-        <w:t xml:space="preserve"> </w:t>
-      </w:r>
-      <w:proofErr w:type="spellStart"/>
-      <w:r>
-        <w:t>MobUpdate</w:t>
-      </w:r>
-      <w:proofErr w:type="spellEnd"/>
-      <w:r>
-        <w:t xml:space="preserve"> is </w:t>
-      </w:r>
-      <w:proofErr w:type="gramStart"/>
-      <w:r>
-        <w:t>fixed-length</w:t>
-      </w:r>
-      <w:proofErr w:type="gramEnd"/>
-      <w:r>
-        <w:t xml:space="preserve"> and steady. </w:t>
-      </w:r>
-      <w:proofErr w:type="spellStart"/>
-      <w:r>
-        <w:t>NpcMoveUpdate</w:t>
-      </w:r>
-      <w:proofErr w:type="spellEnd"/>
-      <w:r>
-        <w:t xml:space="preserve"> is variable-length and event-driven. If two high-frequency opcodes are candidates, the one with the tighter size distribution is </w:t>
-      </w:r>
-      <w:proofErr w:type="spellStart"/>
-      <w:r>
-        <w:t>MobUpdate</w:t>
-      </w:r>
-      <w:proofErr w:type="spellEnd"/>
-      <w:r>
-        <w:t>.</w:t>
+        <w:t xml:space="preserve"> Continues firing when mobs are stationary. The complement of NpcMoveUpdate's burstiness.</w:t>
+      </w:r>
+    </w:p>
+    <w:p>
+      <w:r>
+        <w:rPr>
+          <w:b/>
+          <w:bCs/>
+        </w:rPr>
+        <w:t>Disambiguation from OP_NpcMoveUpdate.</w:t>
+      </w:r>
+      <w:r>
+        <w:t xml:space="preserve"> MobUpdate is fixed-length and steady. NpcMoveUpdate is variable-length and event-driven. If two high-frequency opcodes are candidates, the one with the tighter size distribution is MobUpdate.</w:t>
       </w:r>
     </w:p>
     <w:p>
@@ -734,15 +514,7 @@
         </w:numPr>
       </w:pPr>
       <w:r>
-        <w:t xml:space="preserve">Coordinate fields (x, y, </w:t>
-      </w:r>
-      <w:proofErr w:type="gramStart"/>
-      <w:r>
-        <w:t>z) —</w:t>
-      </w:r>
-      <w:proofErr w:type="gramEnd"/>
-      <w:r>
-        <w:t xml:space="preserve"> historically bit-packed (19 bits each, 3 fractional bits) but not assumed across patches</w:t>
+        <w:t>Coordinate fields (x, y, z) — historically bit-packed (19 bits each, 3 fractional bits) but not assumed across patches</w:t>
       </w:r>
     </w:p>
     <w:p>
@@ -765,47 +537,7 @@
         <w:t>Verification technique.</w:t>
       </w:r>
       <w:r>
-        <w:t xml:space="preserve"> </w:t>
-      </w:r>
-      <w:proofErr w:type="spellStart"/>
-      <w:r>
-        <w:t>MobUpdate's</w:t>
-      </w:r>
-      <w:proofErr w:type="spellEnd"/>
-      <w:r>
-        <w:t xml:space="preserve"> authoritative-snapshot role makes it cross-checkable against </w:t>
-      </w:r>
-      <w:proofErr w:type="spellStart"/>
-      <w:r>
-        <w:t>NpcMoveUpdate</w:t>
-      </w:r>
-      <w:proofErr w:type="spellEnd"/>
-      <w:r>
-        <w:t xml:space="preserve">. For a given spawn ID, </w:t>
-      </w:r>
-      <w:proofErr w:type="spellStart"/>
-      <w:r>
-        <w:t>MobUpdate</w:t>
-      </w:r>
-      <w:proofErr w:type="spellEnd"/>
-      <w:r>
-        <w:t xml:space="preserve"> positions should land near where </w:t>
-      </w:r>
-      <w:proofErr w:type="spellStart"/>
-      <w:r>
-        <w:t>NpcMoveUpdate</w:t>
-      </w:r>
-      <w:proofErr w:type="spellEnd"/>
-      <w:r>
-        <w:t xml:space="preserve"> </w:t>
-      </w:r>
-      <w:proofErr w:type="gramStart"/>
-      <w:r>
-        <w:t>dead-reckoning</w:t>
-      </w:r>
-      <w:proofErr w:type="gramEnd"/>
-      <w:r>
-        <w:t xml:space="preserve"> predicted, within tolerance. If one opcode is decoded correctly and the other isn't, the decoded one serves as ground truth for the other.</w:t>
+        <w:t xml:space="preserve"> MobUpdate's authoritative-snapshot role makes it cross-checkable against NpcMoveUpdate. For a given spawn ID, MobUpdate positions should land near where NpcMoveUpdate dead-reckoning predicted, within tolerance. If one opcode is decoded correctly and the other isn't, the decoded one serves as ground truth for the other.</w:t>
       </w:r>
     </w:p>
     <w:p/>
@@ -833,23 +565,7 @@
         </w:numPr>
       </w:pPr>
       <w:r>
-        <w:t xml:space="preserve">Open the opcode list. The next highest mob-frequency candidate after </w:t>
-      </w:r>
-      <w:proofErr w:type="spellStart"/>
-      <w:r>
-        <w:t>NpcMoveUpdate</w:t>
-      </w:r>
-      <w:proofErr w:type="spellEnd"/>
-      <w:r>
-        <w:t xml:space="preserve"> with a tight size distribution is </w:t>
-      </w:r>
-      <w:proofErr w:type="spellStart"/>
-      <w:r>
-        <w:t>MobUpdate</w:t>
-      </w:r>
-      <w:proofErr w:type="spellEnd"/>
-      <w:r>
-        <w:t>.</w:t>
+        <w:t>Open the opcode list. The next highest mob-frequency candidate after NpcMoveUpdate with a tight size distribution is MobUpdate.</w:t>
       </w:r>
     </w:p>
     <w:p>
@@ -882,23 +598,7 @@
         </w:numPr>
       </w:pPr>
       <w:r>
-        <w:t xml:space="preserve">Pick a spawn observable in-game. Decode its </w:t>
-      </w:r>
-      <w:proofErr w:type="spellStart"/>
-      <w:r>
-        <w:t>MobUpdate</w:t>
-      </w:r>
-      <w:proofErr w:type="spellEnd"/>
-      <w:r>
-        <w:t xml:space="preserve"> entries. </w:t>
-      </w:r>
-      <w:proofErr w:type="gramStart"/>
-      <w:r>
-        <w:t>Compare</w:t>
-      </w:r>
-      <w:proofErr w:type="gramEnd"/>
-      <w:r>
-        <w:t xml:space="preserve"> to observed position.</w:t>
+        <w:t>Pick a spawn observable in-game. Decode its MobUpdate entries. Compare to observed position.</w:t>
       </w:r>
     </w:p>
     <w:p>
@@ -909,15 +609,7 @@
         </w:numPr>
       </w:pPr>
       <w:r>
-        <w:t xml:space="preserve">If </w:t>
-      </w:r>
-      <w:proofErr w:type="spellStart"/>
-      <w:r>
-        <w:t>NpcMoveUpdate</w:t>
-      </w:r>
-      <w:proofErr w:type="spellEnd"/>
-      <w:r>
-        <w:t xml:space="preserve"> is already identified, cross-check positions between the two opcodes for the same spawn.</w:t>
+        <w:t>If NpcMoveUpdate is already identified, cross-check positions between the two opcodes for the same spawn.</w:t>
       </w:r>
     </w:p>
     <w:p>
@@ -979,23 +671,7 @@
         <w:t>Spawn ID byte order.</w:t>
       </w:r>
       <w:r>
-        <w:t xml:space="preserve"> Agrees with </w:t>
-      </w:r>
-      <w:proofErr w:type="spellStart"/>
-      <w:r>
-        <w:t>OP_ZoneEntry</w:t>
-      </w:r>
-      <w:proofErr w:type="spellEnd"/>
-      <w:r>
-        <w:t xml:space="preserve">. Differs from </w:t>
-      </w:r>
-      <w:proofErr w:type="spellStart"/>
-      <w:r>
-        <w:t>OP_NpcMoveUpdate</w:t>
-      </w:r>
-      <w:proofErr w:type="spellEnd"/>
-      <w:r>
-        <w:t>. Stable but verify per patch.</w:t>
+        <w:t xml:space="preserve"> Agrees with OP_ZoneEntry. Differs from OP_NpcMoveUpdate. Stable but verify per patch.</w:t>
       </w:r>
     </w:p>
     <w:p>
@@ -1015,23 +691,7 @@
     </w:p>
     <w:p>
       <w:r>
-        <w:t xml:space="preserve">None for identification. For content verification, having </w:t>
-      </w:r>
-      <w:proofErr w:type="spellStart"/>
-      <w:r>
-        <w:t>OP_</w:t>
-      </w:r>
-      <w:proofErr w:type="gramStart"/>
-      <w:r>
-        <w:t>NpcMoveUpdate</w:t>
-      </w:r>
-      <w:proofErr w:type="spellEnd"/>
-      <w:r>
-        <w:t xml:space="preserve"> decoded</w:t>
-      </w:r>
-      <w:proofErr w:type="gramEnd"/>
-      <w:r>
-        <w:t xml:space="preserve"> provides cross-check via shared spawn IDs and agreeing positions.</w:t>
+        <w:t>None for identification. For content verification, having OP_NpcMoveUpdate decoded provides cross-check via shared spawn IDs and agreeing positions.</w:t>
       </w:r>
     </w:p>
     <w:p>
@@ -1060,12 +720,10 @@
       <w:pPr>
         <w:pStyle w:val="Heading1"/>
       </w:pPr>
-      <w:proofErr w:type="spellStart"/>
       <w:r>
         <w:lastRenderedPageBreak/>
         <w:t>OP_PlayerProfile</w:t>
       </w:r>
-      <w:proofErr w:type="spellEnd"/>
     </w:p>
     <w:p>
       <w:pPr>
@@ -1077,15 +735,7 @@
     </w:p>
     <w:p>
       <w:r>
-        <w:t xml:space="preserve">Bulk character profile load. Sent by the zone server once per character at zone-in. Contains authoritative state of the </w:t>
-      </w:r>
-      <w:proofErr w:type="gramStart"/>
-      <w:r>
-        <w:t>player</w:t>
-      </w:r>
-      <w:proofErr w:type="gramEnd"/>
-      <w:r>
-        <w:t xml:space="preserve"> character. Variable-length, distinctive size signature.</w:t>
+        <w:t>Bulk character profile load. Sent by the zone server once per character at zone-in. Contains authoritative state of the player character. Variable-length, distinctive size signature.</w:t>
       </w:r>
     </w:p>
     <w:p>
@@ -1105,15 +755,7 @@
         <w:t>Size is a strong signal.</w:t>
       </w:r>
       <w:r>
-        <w:t xml:space="preserve"> Historically around 23 KB, variable. After a zone-in, the first packet in the 20 KB range arriving on a session is a good </w:t>
-      </w:r>
-      <w:proofErr w:type="spellStart"/>
-      <w:r>
-        <w:t>PlayerProfile</w:t>
-      </w:r>
-      <w:proofErr w:type="spellEnd"/>
-      <w:r>
-        <w:t xml:space="preserve"> candidate.</w:t>
+        <w:t xml:space="preserve"> Historically around 23 KB, variable. After a zone-in, the first packet in the 20 KB range arriving on a session is a good PlayerProfile candidate.</w:t>
       </w:r>
     </w:p>
     <w:p>
@@ -1125,15 +767,7 @@
         <w:t>Frequency.</w:t>
       </w:r>
       <w:r>
-        <w:t xml:space="preserve"> Very low — one per character per zone-in. In a six-character capture covering one zone-in, exactly six </w:t>
-      </w:r>
-      <w:proofErr w:type="spellStart"/>
-      <w:r>
-        <w:t>PlayerProfile</w:t>
-      </w:r>
-      <w:proofErr w:type="spellEnd"/>
-      <w:r>
-        <w:t xml:space="preserve"> packets should appear.</w:t>
+        <w:t xml:space="preserve"> Very low — one per character per zone-in. In a six-character capture covering one zone-in, exactly six PlayerProfile packets should appear.</w:t>
       </w:r>
     </w:p>
     <w:p>
@@ -1172,28 +806,12 @@
         <w:t>Name presence as confirmation.</w:t>
       </w:r>
       <w:r>
-        <w:t xml:space="preserve"> Character names are known in advance to the operator but not yet associated with session port pairs when the profile arrives. Searching a candidate packet for any of the known character names confirms </w:t>
-      </w:r>
-      <w:proofErr w:type="spellStart"/>
-      <w:r>
-        <w:t>PlayerProfile</w:t>
-      </w:r>
-      <w:proofErr w:type="spellEnd"/>
-      <w:r>
-        <w:t xml:space="preserve"> and binds that session to that character. The name appears in the middle of the payload.</w:t>
-      </w:r>
-    </w:p>
-    <w:p>
-      <w:r>
-        <w:t xml:space="preserve">A 20 KB-range variable-length packet containing one of the known character names is essentially a confirmed </w:t>
-      </w:r>
-      <w:proofErr w:type="spellStart"/>
-      <w:r>
-        <w:t>PlayerProfile</w:t>
-      </w:r>
-      <w:proofErr w:type="spellEnd"/>
-      <w:r>
-        <w:t>.</w:t>
+        <w:t xml:space="preserve"> Character names are known in advance to the operator but not yet associated with session port pairs when the profile arrives. Searching a candidate packet for any of the known character names confirms PlayerProfile and binds that session to that character. The name appears in the middle of the payload.</w:t>
+      </w:r>
+    </w:p>
+    <w:p>
+      <w:r>
+        <w:t>A 20 KB-range variable-length packet containing one of the known character names is essentially a confirmed PlayerProfile.</w:t>
       </w:r>
     </w:p>
     <w:p>
@@ -1240,23 +858,7 @@
         </w:numPr>
       </w:pPr>
       <w:r>
-        <w:t xml:space="preserve">Class byte (note </w:t>
-      </w:r>
-      <w:proofErr w:type="spellStart"/>
-      <w:r>
-        <w:t>EQClass</w:t>
-      </w:r>
-      <w:proofErr w:type="spellEnd"/>
-      <w:r>
-        <w:t xml:space="preserve"> </w:t>
-      </w:r>
-      <w:proofErr w:type="spellStart"/>
-      <w:r>
-        <w:t>enum</w:t>
-      </w:r>
-      <w:proofErr w:type="spellEnd"/>
-      <w:r>
-        <w:t xml:space="preserve"> is off-by-one from wire values)</w:t>
+        <w:t>Class byte (note EQClass enum is off-by-one from wire values)</w:t>
       </w:r>
     </w:p>
     <w:p>
@@ -1324,15 +926,7 @@
         <w:t>Verification technique.</w:t>
       </w:r>
       <w:r>
-        <w:t xml:space="preserve"> Glass has stored last-known character state in the database. For each character, that stored state provides multiple independent anchor values to search for in their </w:t>
-      </w:r>
-      <w:proofErr w:type="spellStart"/>
-      <w:r>
-        <w:t>PlayerProfile</w:t>
-      </w:r>
-      <w:proofErr w:type="spellEnd"/>
-      <w:r>
-        <w:t xml:space="preserve"> packet. With six characters and several anchor fields per character, agreement on an offset across all six characters confirms a field at that offset.</w:t>
+        <w:t xml:space="preserve"> Glass has stored last-known character state in the database. For each character, that stored state provides multiple independent anchor values to search for in their PlayerProfile packet. With six characters and several anchor fields per character, agreement on an offset across all six characters confirms a field at that offset.</w:t>
       </w:r>
     </w:p>
     <w:p>
@@ -1352,41 +946,17 @@
     </w:p>
     <w:p>
       <w:r>
-        <w:t xml:space="preserve">The profile contains the verified fields listed above plus other contents not yet identified. No arrays are known to be present. Variable length is </w:t>
-      </w:r>
-      <w:proofErr w:type="gramStart"/>
-      <w:r>
-        <w:t>real</w:t>
-      </w:r>
-      <w:proofErr w:type="gramEnd"/>
-      <w:r>
-        <w:t xml:space="preserve"> but the source has not been pinned down.</w:t>
-      </w:r>
-    </w:p>
-    <w:p>
-      <w:r>
-        <w:t xml:space="preserve">Inventory has historically been believed to live elsewhere, not in </w:t>
-      </w:r>
-      <w:proofErr w:type="spellStart"/>
-      <w:r>
-        <w:t>PlayerProfile</w:t>
-      </w:r>
-      <w:proofErr w:type="spellEnd"/>
-      <w:r>
-        <w:t>.</w:t>
-      </w:r>
-    </w:p>
-    <w:p>
-      <w:r>
-        <w:t xml:space="preserve">For unidentified profile contents, the diff-after-change technique </w:t>
-      </w:r>
-      <w:proofErr w:type="gramStart"/>
-      <w:r>
-        <w:t>applies:</w:t>
-      </w:r>
-      <w:proofErr w:type="gramEnd"/>
-      <w:r>
-        <w:t xml:space="preserve"> capture a profile with a known state, change something controllable, zone again to force a fresh profile, capture again, diff the two.</w:t>
+        <w:t>The profile contains the verified fields listed above plus other contents not yet identified. No arrays are known to be present. Variable length is real but the source has not been pinned down.</w:t>
+      </w:r>
+    </w:p>
+    <w:p>
+      <w:r>
+        <w:t>Inventory has historically been believed to live elsewhere, not in PlayerProfile.</w:t>
+      </w:r>
+    </w:p>
+    <w:p>
+      <w:r>
+        <w:t>For unidentified profile contents, the diff-after-change technique applies: capture a profile with a known state, change something controllable, zone again to force a fresh profile, capture again, diff the two.</w:t>
       </w:r>
     </w:p>
     <w:p>
@@ -1434,15 +1004,7 @@
         </w:numPr>
       </w:pPr>
       <w:r>
-        <w:t xml:space="preserve">After zone-in, look for the first packet </w:t>
-      </w:r>
-      <w:proofErr w:type="gramStart"/>
-      <w:r>
-        <w:t>on</w:t>
-      </w:r>
-      <w:proofErr w:type="gramEnd"/>
-      <w:r>
-        <w:t xml:space="preserve"> each session in the 20 KB range.</w:t>
+        <w:t>After zone-in, look for the first packet on each session in the 20 KB range.</w:t>
       </w:r>
     </w:p>
     <w:p>
@@ -1453,15 +1015,7 @@
         </w:numPr>
       </w:pPr>
       <w:r>
-        <w:t xml:space="preserve">For each candidate, search for any known character name. A match confirms </w:t>
-      </w:r>
-      <w:proofErr w:type="spellStart"/>
-      <w:r>
-        <w:t>PlayerProfile</w:t>
-      </w:r>
-      <w:proofErr w:type="spellEnd"/>
-      <w:r>
-        <w:t xml:space="preserve"> and identifies which character that session belongs to.</w:t>
+        <w:t>For each candidate, search for any known character name. A match confirms PlayerProfile and identifies which character that session belongs to.</w:t>
       </w:r>
     </w:p>
     <w:p>
@@ -1472,15 +1026,7 @@
         </w:numPr>
       </w:pPr>
       <w:r>
-        <w:t xml:space="preserve">With </w:t>
-      </w:r>
-      <w:proofErr w:type="spellStart"/>
-      <w:r>
-        <w:t>PlayerProfile</w:t>
-      </w:r>
-      <w:proofErr w:type="spellEnd"/>
-      <w:r>
-        <w:t xml:space="preserve"> identified per session, use database anchors to locate other known fields.</w:t>
+        <w:t>With PlayerProfile identified per session, use database anchors to locate other known fields.</w:t>
       </w:r>
     </w:p>
     <w:p>
@@ -1542,15 +1088,7 @@
         <w:t>Variable-length sections</w:t>
       </w:r>
       <w:r>
-        <w:t xml:space="preserve"> make absolute offsets unreliable </w:t>
-      </w:r>
-      <w:proofErr w:type="gramStart"/>
-      <w:r>
-        <w:t>past</w:t>
-      </w:r>
-      <w:proofErr w:type="gramEnd"/>
-      <w:r>
-        <w:t xml:space="preserve"> those sections. Fields after a variable section need re-anchoring per patch.</w:t>
+        <w:t xml:space="preserve"> make absolute offsets unreliable past those sections. Fields after a variable section need re-anchoring per patch.</w:t>
       </w:r>
     </w:p>
     <w:p>
@@ -1606,15 +1144,7 @@
         <w:t>Verification:</w:t>
       </w:r>
       <w:r>
-        <w:t xml:space="preserve"> Requires up-to-date character state in the Glass database. Database currency is a precondition for patch-day </w:t>
-      </w:r>
-      <w:proofErr w:type="spellStart"/>
-      <w:r>
-        <w:t>PlayerProfile</w:t>
-      </w:r>
-      <w:proofErr w:type="spellEnd"/>
-      <w:r>
-        <w:t xml:space="preserve"> verification.</w:t>
+        <w:t xml:space="preserve"> Requires up-to-date character state in the Glass database. Database currency is a precondition for patch-day PlayerProfile verification.</w:t>
       </w:r>
     </w:p>
     <w:p>
@@ -1643,12 +1173,10 @@
       <w:pPr>
         <w:pStyle w:val="Heading1"/>
       </w:pPr>
-      <w:proofErr w:type="spellStart"/>
       <w:r>
         <w:lastRenderedPageBreak/>
         <w:t>OP_CommonMessage</w:t>
       </w:r>
-      <w:proofErr w:type="spellEnd"/>
     </w:p>
     <w:p>
       <w:pPr>
@@ -1672,32 +1200,15 @@
       </w:r>
     </w:p>
     <w:p>
-      <w:proofErr w:type="spellStart"/>
-      <w:r>
-        <w:rPr>
-          <w:b/>
-          <w:bCs/>
-        </w:rPr>
-        <w:t>Triggerability</w:t>
-      </w:r>
-      <w:proofErr w:type="spellEnd"/>
-      <w:r>
-        <w:rPr>
-          <w:b/>
-          <w:bCs/>
-        </w:rPr>
-        <w:t>.</w:t>
-      </w:r>
-      <w:r>
-        <w:t xml:space="preserve"> Operator can produce packets on demand. Send a /say from any character; one </w:t>
-      </w:r>
-      <w:proofErr w:type="spellStart"/>
-      <w:r>
-        <w:t>CommonMessage</w:t>
-      </w:r>
-      <w:proofErr w:type="spellEnd"/>
-      <w:r>
-        <w:t xml:space="preserve"> appears.</w:t>
+      <w:r>
+        <w:rPr>
+          <w:b/>
+          <w:bCs/>
+        </w:rPr>
+        <w:t>Triggerability.</w:t>
+      </w:r>
+      <w:r>
+        <w:t xml:space="preserve"> Operator can produce packets on demand. Send a /say from any character; one CommonMessage appears.</w:t>
       </w:r>
     </w:p>
     <w:p>
@@ -1822,15 +1333,7 @@
         <w:t>Verification technique.</w:t>
       </w:r>
       <w:r>
-        <w:t xml:space="preserve"> Send a sequence of messages with operator-chosen text. The sent text appears literally in the packet. Searching for the known text locates the message field. Searching for the known </w:t>
-      </w:r>
-      <w:proofErr w:type="gramStart"/>
-      <w:r>
-        <w:t>sender</w:t>
-      </w:r>
-      <w:proofErr w:type="gramEnd"/>
-      <w:r>
-        <w:t xml:space="preserve"> name locates the sender field. The channel byte is found by sending identical text on different channels and diffing.</w:t>
+        <w:t xml:space="preserve"> Send a sequence of messages with operator-chosen text. The sent text appears literally in the packet. Searching for the known text locates the message field. Searching for the known sender name locates the sender field. The channel byte is found by sending identical text on different channels and diffing.</w:t>
       </w:r>
     </w:p>
     <w:p>
@@ -1900,15 +1403,7 @@
         </w:numPr>
       </w:pPr>
       <w:r>
-        <w:t xml:space="preserve">The packet at that timestamp on the operator's session is the </w:t>
-      </w:r>
-      <w:proofErr w:type="spellStart"/>
-      <w:r>
-        <w:t>CommonMessage</w:t>
-      </w:r>
-      <w:proofErr w:type="spellEnd"/>
-      <w:r>
-        <w:t xml:space="preserve"> candidate (outbound direction).</w:t>
+        <w:t>The packet at that timestamp on the operator's session is the CommonMessage candidate (outbound direction).</w:t>
       </w:r>
     </w:p>
     <w:p>
@@ -1930,15 +1425,7 @@
         </w:numPr>
       </w:pPr>
       <w:r>
-        <w:t xml:space="preserve">Locate the </w:t>
-      </w:r>
-      <w:proofErr w:type="gramStart"/>
-      <w:r>
-        <w:t>sender</w:t>
-      </w:r>
-      <w:proofErr w:type="gramEnd"/>
-      <w:r>
-        <w:t xml:space="preserve"> name field by searching for the known character name.</w:t>
+        <w:t>Locate the sender name field by searching for the known character name.</w:t>
       </w:r>
     </w:p>
     <w:p>
@@ -1949,15 +1436,7 @@
         </w:numPr>
       </w:pPr>
       <w:r>
-        <w:t>Locate the channel byte by sending identical text on /say vs /</w:t>
-      </w:r>
-      <w:proofErr w:type="spellStart"/>
-      <w:r>
-        <w:t>ooc</w:t>
-      </w:r>
-      <w:proofErr w:type="spellEnd"/>
-      <w:r>
-        <w:t xml:space="preserve"> vs /shout and diffing.</w:t>
+        <w:t>Locate the channel byte by sending identical text on /say vs /ooc vs /shout and diffing.</w:t>
       </w:r>
     </w:p>
     <w:p>
@@ -2019,15 +1498,7 @@
         <w:t>String encoding</w:t>
       </w:r>
       <w:r>
-        <w:t xml:space="preserve"> has historically been ASCII </w:t>
-      </w:r>
-      <w:proofErr w:type="gramStart"/>
-      <w:r>
-        <w:t>null-terminated</w:t>
-      </w:r>
-      <w:proofErr w:type="gramEnd"/>
-      <w:r>
-        <w:t>. Verify each patch.</w:t>
+        <w:t xml:space="preserve"> has historically been ASCII null-terminated. Verify each patch.</w:t>
       </w:r>
     </w:p>
     <w:p>
@@ -2065,15 +1536,7 @@
     </w:p>
     <w:p>
       <w:r>
-        <w:t xml:space="preserve">None. </w:t>
-      </w:r>
-      <w:proofErr w:type="spellStart"/>
-      <w:r>
-        <w:t>CommonMessage</w:t>
-      </w:r>
-      <w:proofErr w:type="spellEnd"/>
-      <w:r>
-        <w:t xml:space="preserve"> can be the first opcode identified post-patch.</w:t>
+        <w:t>None. CommonMessage can be the first opcode identified post-patch.</w:t>
       </w:r>
     </w:p>
     <w:p>
@@ -2102,12 +1565,10 @@
       <w:pPr>
         <w:pStyle w:val="Heading1"/>
       </w:pPr>
-      <w:proofErr w:type="spellStart"/>
       <w:r>
         <w:lastRenderedPageBreak/>
         <w:t>OP_FormattedMessage</w:t>
       </w:r>
-      <w:proofErr w:type="spellEnd"/>
     </w:p>
     <w:p>
       <w:pPr>
@@ -2119,15 +1580,7 @@
     </w:p>
     <w:p>
       <w:r>
-        <w:t xml:space="preserve">Server-originated </w:t>
-      </w:r>
-      <w:proofErr w:type="gramStart"/>
-      <w:r>
-        <w:t>formatted</w:t>
-      </w:r>
-      <w:proofErr w:type="gramEnd"/>
-      <w:r>
-        <w:t xml:space="preserve"> messages. Carries template IDs plus argument strings; the client substitutes them into localized format strings. Used for spell-casting feedback, system messages, faction changes, and tracking output. Not combat-driven.</w:t>
+        <w:t>Server-originated formatted messages. Carries template IDs plus argument strings; the client substitutes them into localized format strings. Used for spell-casting feedback, system messages, faction changes, and tracking output. Not combat-driven.</w:t>
       </w:r>
     </w:p>
     <w:p>
@@ -2139,85 +1592,52 @@
       </w:r>
     </w:p>
     <w:p>
-      <w:proofErr w:type="spellStart"/>
-      <w:r>
-        <w:rPr>
-          <w:b/>
-          <w:bCs/>
-        </w:rPr>
-        <w:t>Triggerability</w:t>
-      </w:r>
-      <w:proofErr w:type="spellEnd"/>
-      <w:r>
-        <w:rPr>
-          <w:b/>
-          <w:bCs/>
-        </w:rPr>
-        <w:t>.</w:t>
-      </w:r>
-      <w:r>
-        <w:t xml:space="preserve"> Operator-controllable. Cast a spell, gain a faction, activate tracking — each </w:t>
-      </w:r>
-      <w:proofErr w:type="gramStart"/>
-      <w:r>
-        <w:t>produces</w:t>
-      </w:r>
-      <w:proofErr w:type="gramEnd"/>
+      <w:r>
+        <w:rPr>
+          <w:b/>
+          <w:bCs/>
+        </w:rPr>
+        <w:t>Triggerability.</w:t>
+      </w:r>
+      <w:r>
+        <w:t xml:space="preserve"> Operator-controllable. Cast a spell, gain a faction, activate tracking — each produces FormattedMessage packets.</w:t>
+      </w:r>
+    </w:p>
+    <w:p>
+      <w:r>
+        <w:rPr>
+          <w:b/>
+          <w:bCs/>
+        </w:rPr>
+        <w:t>Size.</w:t>
+      </w:r>
+      <w:r>
+        <w:t xml:space="preserve"> Variable, but smaller than CommonMessage on average. Payload carries template IDs and arguments rather than fully rendered text.</w:t>
+      </w:r>
+    </w:p>
+    <w:p>
+      <w:r>
+        <w:rPr>
+          <w:b/>
+          <w:bCs/>
+        </w:rPr>
+        <w:t>Frequency.</w:t>
+      </w:r>
+      <w:r>
+        <w:t xml:space="preserve"> Sporadic. Triggered by specific events.</w:t>
+      </w:r>
+    </w:p>
+    <w:p>
+      <w:r>
+        <w:rPr>
+          <w:b/>
+          <w:bCs/>
+        </w:rPr>
+        <w:t>Direction.</w:t>
+      </w:r>
       <w:r>
         <w:t xml:space="preserve"> </w:t>
       </w:r>
-      <w:proofErr w:type="spellStart"/>
-      <w:r>
-        <w:t>FormattedMessage</w:t>
-      </w:r>
-      <w:proofErr w:type="spellEnd"/>
-      <w:r>
-        <w:t xml:space="preserve"> packets.</w:t>
-      </w:r>
-    </w:p>
-    <w:p>
-      <w:r>
-        <w:rPr>
-          <w:b/>
-          <w:bCs/>
-        </w:rPr>
-        <w:t>Size.</w:t>
-      </w:r>
-      <w:r>
-        <w:t xml:space="preserve"> Variable, but smaller than </w:t>
-      </w:r>
-      <w:proofErr w:type="spellStart"/>
-      <w:r>
-        <w:t>CommonMessage</w:t>
-      </w:r>
-      <w:proofErr w:type="spellEnd"/>
-      <w:r>
-        <w:t xml:space="preserve"> on average. Payload carries template IDs and arguments rather than fully rendered text.</w:t>
-      </w:r>
-    </w:p>
-    <w:p>
-      <w:r>
-        <w:rPr>
-          <w:b/>
-          <w:bCs/>
-        </w:rPr>
-        <w:t>Frequency.</w:t>
-      </w:r>
-      <w:r>
-        <w:t xml:space="preserve"> Sporadic. Triggered by specific events.</w:t>
-      </w:r>
-    </w:p>
-    <w:p>
-      <w:r>
-        <w:rPr>
-          <w:b/>
-          <w:bCs/>
-        </w:rPr>
-        <w:t>Direction.</w:t>
-      </w:r>
-      <w:r>
-        <w:t xml:space="preserve"> </w:t>
-      </w:r>
       <w:r>
         <w:t>Z2C</w:t>
       </w:r>
@@ -2240,42 +1660,10 @@
           <w:b/>
           <w:bCs/>
         </w:rPr>
-        <w:t xml:space="preserve">Disambiguation from </w:t>
-      </w:r>
-      <w:proofErr w:type="spellStart"/>
-      <w:r>
-        <w:rPr>
-          <w:b/>
-          <w:bCs/>
-        </w:rPr>
-        <w:t>CommonMessage</w:t>
-      </w:r>
-      <w:proofErr w:type="spellEnd"/>
-      <w:r>
-        <w:rPr>
-          <w:b/>
-          <w:bCs/>
-        </w:rPr>
-        <w:t>.</w:t>
-      </w:r>
-      <w:r>
-        <w:t xml:space="preserve"> </w:t>
-      </w:r>
-      <w:proofErr w:type="spellStart"/>
-      <w:r>
-        <w:t>CommonMessage</w:t>
-      </w:r>
-      <w:proofErr w:type="spellEnd"/>
-      <w:r>
-        <w:t xml:space="preserve"> carries literal text; </w:t>
-      </w:r>
-      <w:proofErr w:type="spellStart"/>
-      <w:r>
-        <w:t>FormattedMessage</w:t>
-      </w:r>
-      <w:proofErr w:type="spellEnd"/>
-      <w:r>
-        <w:t xml:space="preserve"> carries template IDs and arguments. Visually different on the wire.</w:t>
+        <w:t>Disambiguation from CommonMessage.</w:t>
+      </w:r>
+      <w:r>
+        <w:t xml:space="preserve"> CommonMessage carries literal text; FormattedMessage carries template IDs and arguments. Visually different on the wire.</w:t>
       </w:r>
     </w:p>
     <w:p>
@@ -2374,44 +1762,12 @@
         <w:t>Verification technique.</w:t>
       </w:r>
       <w:r>
-        <w:t xml:space="preserve"> Trigger a specific known message. The argument string appears in the packet. Repeat the same trigger; the template ID stays </w:t>
-      </w:r>
-      <w:proofErr w:type="gramStart"/>
-      <w:r>
-        <w:t>constant,</w:t>
-      </w:r>
-      <w:proofErr w:type="gramEnd"/>
-      <w:r>
-        <w:t xml:space="preserve"> argument values vary across instances.</w:t>
-      </w:r>
-    </w:p>
-    <w:p>
-      <w:r>
-        <w:t xml:space="preserve">Tracking is the strongest trigger for </w:t>
-      </w:r>
-      <w:proofErr w:type="spellStart"/>
-      <w:r>
-        <w:t>FormattedMessage</w:t>
-      </w:r>
-      <w:proofErr w:type="spellEnd"/>
-      <w:r>
-        <w:t xml:space="preserve"> identification: ranger or druid Track activation produces multiple </w:t>
-      </w:r>
-      <w:proofErr w:type="spellStart"/>
-      <w:r>
-        <w:t>FormattedMessage</w:t>
-      </w:r>
-      <w:proofErr w:type="spellEnd"/>
-      <w:r>
-        <w:t xml:space="preserve"> packets with diverse argument content (different mob names per entry). The repeated structure across many packets with varying string content reveals argument layout cleanly. Spell-cast feedback also produces </w:t>
-      </w:r>
-      <w:proofErr w:type="spellStart"/>
-      <w:r>
-        <w:t>FormattedMessages</w:t>
-      </w:r>
-      <w:proofErr w:type="spellEnd"/>
-      <w:r>
-        <w:t xml:space="preserve"> but in smaller bursts.</w:t>
+        <w:t xml:space="preserve"> Trigger a specific known message. The argument string appears in the packet. Repeat the same trigger; the template ID stays constant, argument values vary across instances.</w:t>
+      </w:r>
+    </w:p>
+    <w:p>
+      <w:r>
+        <w:t>Tracking is the strongest trigger for FormattedMessage identification: ranger or druid Track activation produces multiple FormattedMessage packets with diverse argument content (different mob names per entry). The repeated structure across many packets with varying string content reveals argument layout cleanly. Spell-cast feedback also produces FormattedMessages but in smaller bursts.</w:t>
       </w:r>
     </w:p>
     <w:p>
@@ -2448,15 +1804,7 @@
         </w:numPr>
       </w:pPr>
       <w:r>
-        <w:t xml:space="preserve">On a ranger or druid, activate Track. Multiple </w:t>
-      </w:r>
-      <w:proofErr w:type="spellStart"/>
-      <w:r>
-        <w:t>FormattedMessage</w:t>
-      </w:r>
-      <w:proofErr w:type="spellEnd"/>
-      <w:r>
-        <w:t xml:space="preserve"> packets should arrive carrying mob names.</w:t>
+        <w:t>On a ranger or druid, activate Track. Multiple FormattedMessage packets should arrive carrying mob names.</w:t>
       </w:r>
     </w:p>
     <w:p>
@@ -2522,15 +1870,7 @@
         <w:t>Template ID table</w:t>
       </w:r>
       <w:r>
-        <w:t xml:space="preserve"> is itself </w:t>
-      </w:r>
-      <w:proofErr w:type="gramStart"/>
-      <w:r>
-        <w:t>patch-mutable</w:t>
-      </w:r>
-      <w:proofErr w:type="gramEnd"/>
-      <w:r>
-        <w:t>. Anchor on argument content rather than template ID.</w:t>
+        <w:t xml:space="preserve"> is itself patch-mutable. Anchor on argument content rather than template ID.</w:t>
       </w:r>
     </w:p>
     <w:p>
@@ -2597,12 +1937,10 @@
       <w:pPr>
         <w:pStyle w:val="Heading1"/>
       </w:pPr>
-      <w:proofErr w:type="spellStart"/>
       <w:r>
         <w:lastRenderedPageBreak/>
         <w:t>OP_Death</w:t>
       </w:r>
-      <w:proofErr w:type="spellEnd"/>
     </w:p>
     <w:p>
       <w:pPr>
@@ -2626,21 +1964,12 @@
       </w:r>
     </w:p>
     <w:p>
-      <w:proofErr w:type="spellStart"/>
-      <w:r>
-        <w:rPr>
-          <w:b/>
-          <w:bCs/>
-        </w:rPr>
-        <w:t>Triggerability</w:t>
-      </w:r>
-      <w:proofErr w:type="spellEnd"/>
-      <w:r>
-        <w:rPr>
-          <w:b/>
-          <w:bCs/>
-        </w:rPr>
-        <w:t>.</w:t>
+      <w:r>
+        <w:rPr>
+          <w:b/>
+          <w:bCs/>
+        </w:rPr>
+        <w:t>Triggerability.</w:t>
       </w:r>
       <w:r>
         <w:t xml:space="preserve"> Operator-controllable. Kill a mob; one Death packet appears.</w:t>
@@ -2694,15 +2023,7 @@
         <w:t>Context.</w:t>
       </w:r>
       <w:r>
-        <w:t xml:space="preserve"> Fires </w:t>
-      </w:r>
-      <w:proofErr w:type="gramStart"/>
-      <w:r>
-        <w:t>at the moment</w:t>
-      </w:r>
-      <w:proofErr w:type="gramEnd"/>
-      <w:r>
-        <w:t xml:space="preserve"> of a kill. No accompanying messages unless the operator sends one. Death is a discrete event on the wire.</w:t>
+        <w:t xml:space="preserve"> Fires at the moment of a kill. No accompanying messages unless the operator sends one. Death is a discrete event on the wire.</w:t>
       </w:r>
     </w:p>
     <w:p>
@@ -2776,23 +2097,7 @@
         </w:numPr>
       </w:pPr>
       <w:r>
-        <w:t xml:space="preserve">The killer's spawn ID is the operator's own character's spawn ID (known from </w:t>
-      </w:r>
-      <w:proofErr w:type="spellStart"/>
-      <w:r>
-        <w:t>PlayerProfile</w:t>
-      </w:r>
-      <w:proofErr w:type="spellEnd"/>
-      <w:r>
-        <w:t xml:space="preserve"> or self-</w:t>
-      </w:r>
-      <w:proofErr w:type="spellStart"/>
-      <w:r>
-        <w:t>ZoneEntry</w:t>
-      </w:r>
-      <w:proofErr w:type="spellEnd"/>
-      <w:r>
-        <w:t>).</w:t>
+        <w:t>The killer's spawn ID is the operator's own character's spawn ID (known from PlayerProfile or self-ZoneEntry).</w:t>
       </w:r>
     </w:p>
     <w:p>
@@ -2803,36 +2108,12 @@
         </w:numPr>
       </w:pPr>
       <w:r>
-        <w:t xml:space="preserve">The victim's spawn ID can be cross-referenced from </w:t>
-      </w:r>
-      <w:proofErr w:type="spellStart"/>
-      <w:r>
-        <w:t>MobUpdate</w:t>
-      </w:r>
-      <w:proofErr w:type="spellEnd"/>
-      <w:r>
-        <w:t xml:space="preserve"> or </w:t>
-      </w:r>
-      <w:proofErr w:type="spellStart"/>
-      <w:r>
-        <w:t>NpcMoveUpdate</w:t>
-      </w:r>
-      <w:proofErr w:type="spellEnd"/>
-      <w:r>
-        <w:t xml:space="preserve"> packets for that mob immediately prior to its death.</w:t>
-      </w:r>
-    </w:p>
-    <w:p>
-      <w:r>
-        <w:t xml:space="preserve">Kill the same mob type repeatedly. Each Death packet should show killer ID constant (operator's character) and victim ID varying. The </w:t>
-      </w:r>
-      <w:proofErr w:type="gramStart"/>
-      <w:r>
-        <w:t>constant-vs-varying</w:t>
-      </w:r>
-      <w:proofErr w:type="gramEnd"/>
-      <w:r>
-        <w:t xml:space="preserve"> pattern identifies which field is which.</w:t>
+        <w:t>The victim's spawn ID can be cross-referenced from MobUpdate or NpcMoveUpdate packets for that mob immediately prior to its death.</w:t>
+      </w:r>
+    </w:p>
+    <w:p>
+      <w:r>
+        <w:t>Kill the same mob type repeatedly. Each Death packet should show killer ID constant (operator's character) and victim ID varying. The constant-vs-varying pattern identifies which field is which.</w:t>
       </w:r>
     </w:p>
     <w:p>
@@ -2978,23 +2259,7 @@
         <w:t>Spawn ID byte order.</w:t>
       </w:r>
       <w:r>
-        <w:t xml:space="preserve"> Death historically agrees with </w:t>
-      </w:r>
-      <w:proofErr w:type="spellStart"/>
-      <w:r>
-        <w:t>ZoneEntry</w:t>
-      </w:r>
-      <w:proofErr w:type="spellEnd"/>
-      <w:r>
-        <w:t xml:space="preserve"> / </w:t>
-      </w:r>
-      <w:proofErr w:type="spellStart"/>
-      <w:r>
-        <w:t>MobUpdate</w:t>
-      </w:r>
-      <w:proofErr w:type="spellEnd"/>
-      <w:r>
-        <w:t xml:space="preserve"> byte order. Verify per patch.</w:t>
+        <w:t xml:space="preserve"> Death historically agrees with ZoneEntry / MobUpdate byte order. Verify per patch.</w:t>
       </w:r>
     </w:p>
     <w:p>
@@ -3069,15 +2334,7 @@
         <w:t>Verification:</w:t>
       </w:r>
       <w:r>
-        <w:t xml:space="preserve"> Knowing the operator's own spawn ID and recent victim spawn IDs </w:t>
-      </w:r>
-      <w:proofErr w:type="gramStart"/>
-      <w:r>
-        <w:t>makes</w:t>
-      </w:r>
-      <w:proofErr w:type="gramEnd"/>
-      <w:r>
-        <w:t xml:space="preserve"> verification more direct. Without those, identification of which ID is which still works by constant-vs-varying across repeated kills.</w:t>
+        <w:t xml:space="preserve"> Knowing the operator's own spawn ID and recent victim spawn IDs makes verification more direct. Without those, identification of which ID is which still works by constant-vs-varying across repeated kills.</w:t>
       </w:r>
     </w:p>
     <w:p>
@@ -3106,12 +2363,10 @@
       <w:pPr>
         <w:pStyle w:val="Heading1"/>
       </w:pPr>
-      <w:proofErr w:type="spellStart"/>
       <w:r>
         <w:lastRenderedPageBreak/>
         <w:t>OP_ZoneEntry</w:t>
       </w:r>
-      <w:proofErr w:type="spellEnd"/>
     </w:p>
     <w:p>
       <w:pPr>
@@ -3143,31 +2398,7 @@
         <w:t>Burst signature.</w:t>
       </w:r>
       <w:r>
-        <w:t xml:space="preserve"> The most distinctive context clue. After zone-in, the server sends one </w:t>
-      </w:r>
-      <w:proofErr w:type="spellStart"/>
-      <w:r>
-        <w:t>ZoneEntry</w:t>
-      </w:r>
-      <w:proofErr w:type="spellEnd"/>
-      <w:r>
-        <w:t xml:space="preserve"> per spawn currently in the zone — typically hundreds in a populated zone. Many packets of the same opcode arriving back-to-back, with similar </w:t>
-      </w:r>
-      <w:proofErr w:type="gramStart"/>
-      <w:r>
-        <w:t>structure</w:t>
-      </w:r>
-      <w:proofErr w:type="gramEnd"/>
-      <w:r>
-        <w:t xml:space="preserve"> varying in </w:t>
-      </w:r>
-      <w:proofErr w:type="gramStart"/>
-      <w:r>
-        <w:t>details</w:t>
-      </w:r>
-      <w:proofErr w:type="gramEnd"/>
-      <w:r>
-        <w:t>.</w:t>
+        <w:t xml:space="preserve"> The most distinctive context clue. After zone-in, the server sends one ZoneEntry per spawn currently in the zone — typically hundreds in a populated zone. Many packets of the same opcode arriving back-to-back, with similar structure varying in details.</w:t>
       </w:r>
     </w:p>
     <w:p>
@@ -3179,15 +2410,7 @@
         <w:t>Frequency.</w:t>
       </w:r>
       <w:r>
-        <w:t xml:space="preserve"> Heavy burst at zone-in, sporadic thereafter. The zone-in burst alone makes </w:t>
-      </w:r>
-      <w:proofErr w:type="spellStart"/>
-      <w:r>
-        <w:t>ZoneEntry</w:t>
-      </w:r>
-      <w:proofErr w:type="spellEnd"/>
-      <w:r>
-        <w:t xml:space="preserve"> the highest-count opcode in the first second after a zone-in.</w:t>
+        <w:t xml:space="preserve"> Heavy burst at zone-in, sporadic thereafter. The zone-in burst alone makes ZoneEntry the highest-count opcode in the first second after a zone-in.</w:t>
       </w:r>
     </w:p>
     <w:p>
@@ -3223,31 +2446,7 @@
         <w:t>Context.</w:t>
       </w:r>
       <w:r>
-        <w:t xml:space="preserve"> Bursts during zone-in, after </w:t>
-      </w:r>
-      <w:proofErr w:type="spellStart"/>
-      <w:r>
-        <w:t>PlayerProfile</w:t>
-      </w:r>
-      <w:proofErr w:type="spellEnd"/>
-      <w:r>
-        <w:t xml:space="preserve"> delivery. Sequence: session establishment → </w:t>
-      </w:r>
-      <w:proofErr w:type="spellStart"/>
-      <w:r>
-        <w:t>PlayerProfile</w:t>
-      </w:r>
-      <w:proofErr w:type="spellEnd"/>
-      <w:r>
-        <w:t xml:space="preserve"> → </w:t>
-      </w:r>
-      <w:proofErr w:type="spellStart"/>
-      <w:r>
-        <w:t>ZoneEntry</w:t>
-      </w:r>
-      <w:proofErr w:type="spellEnd"/>
-      <w:r>
-        <w:t xml:space="preserve"> burst → settled-state position updates.</w:t>
+        <w:t xml:space="preserve"> Bursts during zone-in, after PlayerProfile delivery. Sequence: session establishment → PlayerProfile → ZoneEntry burst → settled-state position updates.</w:t>
       </w:r>
     </w:p>
     <w:p>
@@ -3331,15 +2530,7 @@
         </w:numPr>
       </w:pPr>
       <w:r>
-        <w:t xml:space="preserve">Position (x, y, z, </w:t>
-      </w:r>
-      <w:proofErr w:type="gramStart"/>
-      <w:r>
-        <w:t>heading) —</w:t>
-      </w:r>
-      <w:proofErr w:type="gramEnd"/>
-      <w:r>
-        <w:t xml:space="preserve"> historical presence uncertain</w:t>
+        <w:t>Position (x, y, z, heading) — historical presence uncertain</w:t>
       </w:r>
     </w:p>
     <w:p>
@@ -3382,44 +2573,12 @@
         <w:t>Verification technique.</w:t>
       </w:r>
       <w:r>
-        <w:t xml:space="preserve"> Self-</w:t>
-      </w:r>
-      <w:proofErr w:type="spellStart"/>
-      <w:r>
-        <w:t>ZoneEntry</w:t>
-      </w:r>
-      <w:proofErr w:type="spellEnd"/>
-      <w:r>
-        <w:t xml:space="preserve"> is the strongest anchor. When the operator's character zones in, the server sends a </w:t>
-      </w:r>
-      <w:proofErr w:type="spellStart"/>
-      <w:r>
-        <w:t>ZoneEntry</w:t>
-      </w:r>
-      <w:proofErr w:type="spellEnd"/>
-      <w:r>
-        <w:t xml:space="preserve"> for that character. Searching the burst for the known character name locates the self-</w:t>
-      </w:r>
-      <w:proofErr w:type="spellStart"/>
-      <w:r>
-        <w:t>ZoneEntry</w:t>
-      </w:r>
-      <w:proofErr w:type="spellEnd"/>
-      <w:r>
-        <w:t>. That packet's fields can be anchored against every value Glass has stored for that character.</w:t>
-      </w:r>
-    </w:p>
-    <w:p>
-      <w:r>
-        <w:t xml:space="preserve">Multi-anchor packet from a single capture, comparable to </w:t>
-      </w:r>
-      <w:proofErr w:type="spellStart"/>
-      <w:r>
-        <w:t>PlayerProfile's</w:t>
-      </w:r>
-      <w:proofErr w:type="spellEnd"/>
-      <w:r>
-        <w:t xml:space="preserve"> verification strength.</w:t>
+        <w:t xml:space="preserve"> Self-ZoneEntry is the strongest anchor. When the operator's character zones in, the server sends a ZoneEntry for that character. Searching the burst for the known character name locates the self-ZoneEntry. That packet's fields can be anchored against every value Glass has stored for that character.</w:t>
+      </w:r>
+    </w:p>
+    <w:p>
+      <w:r>
+        <w:t>Multi-anchor packet from a single capture, comparable to PlayerProfile's verification strength.</w:t>
       </w:r>
     </w:p>
     <w:p>
@@ -3461,15 +2620,7 @@
         </w:numPr>
       </w:pPr>
       <w:r>
-        <w:t xml:space="preserve">Identify the candidate by burst signature: largest count in the first second after </w:t>
-      </w:r>
-      <w:proofErr w:type="spellStart"/>
-      <w:r>
-        <w:t>PlayerProfile</w:t>
-      </w:r>
-      <w:proofErr w:type="spellEnd"/>
-      <w:r>
-        <w:t xml:space="preserve"> delivery, variable but moderate payload size.</w:t>
+        <w:t>Identify the candidate by burst signature: largest count in the first second after PlayerProfile delivery, variable but moderate payload size.</w:t>
       </w:r>
     </w:p>
     <w:p>
@@ -3480,15 +2631,7 @@
         </w:numPr>
       </w:pPr>
       <w:r>
-        <w:t>Within the burst, search for the operator's known character name. The matching packet is self-</w:t>
-      </w:r>
-      <w:proofErr w:type="spellStart"/>
-      <w:r>
-        <w:t>ZoneEntry</w:t>
-      </w:r>
-      <w:proofErr w:type="spellEnd"/>
-      <w:r>
-        <w:t>.</w:t>
+        <w:t>Within the burst, search for the operator's known character name. The matching packet is self-ZoneEntry.</w:t>
       </w:r>
     </w:p>
     <w:p>
@@ -3510,23 +2653,7 @@
         </w:numPr>
       </w:pPr>
       <w:r>
-        <w:t xml:space="preserve">Cross-check by </w:t>
-      </w:r>
-      <w:proofErr w:type="gramStart"/>
-      <w:r>
-        <w:t>searching</w:t>
-      </w:r>
-      <w:proofErr w:type="gramEnd"/>
-      <w:r>
-        <w:t xml:space="preserve"> other </w:t>
-      </w:r>
-      <w:proofErr w:type="spellStart"/>
-      <w:r>
-        <w:t>ZoneEntry</w:t>
-      </w:r>
-      <w:proofErr w:type="spellEnd"/>
-      <w:r>
-        <w:t xml:space="preserve"> packets for other known names (zone guards, named NPCs).</w:t>
+        <w:t>Cross-check by searching other ZoneEntry packets for other known names (zone guards, named NPCs).</w:t>
       </w:r>
     </w:p>
     <w:p>
@@ -3588,15 +2715,7 @@
         <w:t>Position presence.</w:t>
       </w:r>
       <w:r>
-        <w:t xml:space="preserve"> Historically uncertain whether </w:t>
-      </w:r>
-      <w:proofErr w:type="spellStart"/>
-      <w:r>
-        <w:t>ZoneEntry</w:t>
-      </w:r>
-      <w:proofErr w:type="spellEnd"/>
-      <w:r>
-        <w:t xml:space="preserve"> carries position.</w:t>
+        <w:t xml:space="preserve"> Historically uncertain whether ZoneEntry carries position.</w:t>
       </w:r>
     </w:p>
     <w:p>
@@ -3614,23 +2733,7 @@
         <w:t>Spawn ID byte order.</w:t>
       </w:r>
       <w:r>
-        <w:t xml:space="preserve"> Agrees with </w:t>
-      </w:r>
-      <w:proofErr w:type="spellStart"/>
-      <w:r>
-        <w:t>OP_MobUpdate</w:t>
-      </w:r>
-      <w:proofErr w:type="spellEnd"/>
-      <w:r>
-        <w:t xml:space="preserve">. Differs from </w:t>
-      </w:r>
-      <w:proofErr w:type="spellStart"/>
-      <w:r>
-        <w:t>OP_NpcMoveUpdate</w:t>
-      </w:r>
-      <w:proofErr w:type="spellEnd"/>
-      <w:r>
-        <w:t>.</w:t>
+        <w:t xml:space="preserve"> Agrees with OP_MobUpdate. Differs from OP_NpcMoveUpdate.</w:t>
       </w:r>
     </w:p>
     <w:p>
@@ -3725,12 +2828,10 @@
       <w:pPr>
         <w:pStyle w:val="Heading1"/>
       </w:pPr>
-      <w:proofErr w:type="spellStart"/>
       <w:r>
         <w:lastRenderedPageBreak/>
         <w:t>OP_Target</w:t>
       </w:r>
-      <w:proofErr w:type="spellEnd"/>
     </w:p>
     <w:p>
       <w:pPr>
@@ -3766,21 +2867,12 @@
       </w:r>
     </w:p>
     <w:p>
-      <w:proofErr w:type="spellStart"/>
-      <w:r>
-        <w:rPr>
-          <w:b/>
-          <w:bCs/>
-        </w:rPr>
-        <w:t>Triggerability</w:t>
-      </w:r>
-      <w:proofErr w:type="spellEnd"/>
-      <w:r>
-        <w:rPr>
-          <w:b/>
-          <w:bCs/>
-        </w:rPr>
-        <w:t xml:space="preserve"> is the only viable signal.</w:t>
+      <w:r>
+        <w:rPr>
+          <w:b/>
+          <w:bCs/>
+        </w:rPr>
+        <w:t>Triggerability is the only viable signal.</w:t>
       </w:r>
       <w:r>
         <w:t xml:space="preserve"> Click on a known mob; one small packet appears at that timestamp containing that mob's spawn ID. The combination of:</w:t>
@@ -3821,15 +2913,7 @@
     </w:p>
     <w:p>
       <w:r>
-        <w:t xml:space="preserve">is what </w:t>
-      </w:r>
-      <w:proofErr w:type="gramStart"/>
-      <w:r>
-        <w:t>identifies</w:t>
-      </w:r>
-      <w:proofErr w:type="gramEnd"/>
-      <w:r>
-        <w:t xml:space="preserve"> Target.</w:t>
+        <w:t>is what identifies Target.</w:t>
       </w:r>
     </w:p>
     <w:p>
@@ -3853,15 +2937,7 @@
         <w:t>Frequency.</w:t>
       </w:r>
       <w:r>
-        <w:t xml:space="preserve"> Sporadic, </w:t>
-      </w:r>
-      <w:proofErr w:type="gramStart"/>
-      <w:r>
-        <w:t>operator-controlled</w:t>
-      </w:r>
-      <w:proofErr w:type="gramEnd"/>
-      <w:r>
-        <w:t>.</w:t>
+        <w:t xml:space="preserve"> Sporadic, operator-controlled.</w:t>
       </w:r>
     </w:p>
     <w:p>
@@ -3889,15 +2965,7 @@
     </w:p>
     <w:p>
       <w:r>
-        <w:t xml:space="preserve">Single-field payload. Verification </w:t>
-      </w:r>
-      <w:proofErr w:type="gramStart"/>
-      <w:r>
-        <w:t>is confirming</w:t>
-      </w:r>
-      <w:proofErr w:type="gramEnd"/>
-      <w:r>
-        <w:t xml:space="preserve"> the bytes match the known spawn ID at the expected offset.</w:t>
+        <w:t>Single-field payload. Verification is confirming the bytes match the known spawn ID at the expected offset.</w:t>
       </w:r>
     </w:p>
     <w:p>
@@ -3909,23 +2977,7 @@
         <w:t>Verification technique.</w:t>
       </w:r>
       <w:r>
-        <w:t xml:space="preserve"> Target a sequence of mobs whose spawn IDs are known from recent </w:t>
-      </w:r>
-      <w:proofErr w:type="spellStart"/>
-      <w:r>
-        <w:t>ZoneEntry</w:t>
-      </w:r>
-      <w:proofErr w:type="spellEnd"/>
-      <w:r>
-        <w:t xml:space="preserve"> or </w:t>
-      </w:r>
-      <w:proofErr w:type="spellStart"/>
-      <w:r>
-        <w:t>MobUpdate</w:t>
-      </w:r>
-      <w:proofErr w:type="spellEnd"/>
-      <w:r>
-        <w:t xml:space="preserve"> traffic. Each Target packet should contain the corresponding ID. Vary the targeted mob and confirm the bytes change.</w:t>
+        <w:t xml:space="preserve"> Target a sequence of mobs whose spawn IDs are known from recent ZoneEntry or MobUpdate traffic. Each Target packet should contain the corresponding ID. Vary the targeted mob and confirm the bytes change.</w:t>
       </w:r>
     </w:p>
     <w:p>
@@ -3988,23 +3040,7 @@
         </w:numPr>
       </w:pPr>
       <w:r>
-        <w:t xml:space="preserve">Identify spawn IDs of nearby mobs from recent </w:t>
-      </w:r>
-      <w:proofErr w:type="spellStart"/>
-      <w:r>
-        <w:t>ZoneEntry</w:t>
-      </w:r>
-      <w:proofErr w:type="spellEnd"/>
-      <w:r>
-        <w:t xml:space="preserve"> or </w:t>
-      </w:r>
-      <w:proofErr w:type="spellStart"/>
-      <w:r>
-        <w:t>MobUpdate</w:t>
-      </w:r>
-      <w:proofErr w:type="spellEnd"/>
-      <w:r>
-        <w:t>.</w:t>
+        <w:t>Identify spawn IDs of nearby mobs from recent ZoneEntry or MobUpdate.</w:t>
       </w:r>
     </w:p>
     <w:p>
@@ -4148,23 +3184,7 @@
     </w:p>
     <w:p>
       <w:r>
-        <w:t xml:space="preserve">Requires known target spawn IDs from recent </w:t>
-      </w:r>
-      <w:proofErr w:type="spellStart"/>
-      <w:r>
-        <w:t>ZoneEntry</w:t>
-      </w:r>
-      <w:proofErr w:type="spellEnd"/>
-      <w:r>
-        <w:t xml:space="preserve"> or </w:t>
-      </w:r>
-      <w:proofErr w:type="spellStart"/>
-      <w:r>
-        <w:t>MobUpdate</w:t>
-      </w:r>
-      <w:proofErr w:type="spellEnd"/>
-      <w:r>
-        <w:t>, plus operator action. Identification cannot succeed from packet content alone.</w:t>
+        <w:t>Requires known target spawn IDs from recent ZoneEntry or MobUpdate, plus operator action. Identification cannot succeed from packet content alone.</w:t>
       </w:r>
     </w:p>
     <w:p>
@@ -4220,21 +3240,12 @@
       </w:r>
     </w:p>
     <w:p>
-      <w:proofErr w:type="spellStart"/>
-      <w:r>
-        <w:rPr>
-          <w:b/>
-          <w:bCs/>
-        </w:rPr>
-        <w:t>Triggerability</w:t>
-      </w:r>
-      <w:proofErr w:type="spellEnd"/>
-      <w:r>
-        <w:rPr>
-          <w:b/>
-          <w:bCs/>
-        </w:rPr>
-        <w:t xml:space="preserve"> is value-based, not event-based.</w:t>
+      <w:r>
+        <w:rPr>
+          <w:b/>
+          <w:bCs/>
+        </w:rPr>
+        <w:t>Triggerability is value-based, not event-based.</w:t>
       </w:r>
       <w:r>
         <w:t xml:space="preserve"> The server decides when to send updates. The operator influences the value, not the timing.</w:t>
@@ -4317,15 +3328,7 @@
         </w:numPr>
       </w:pPr>
       <w:r>
-        <w:t xml:space="preserve">HP value (numeric width and </w:t>
-      </w:r>
-      <w:proofErr w:type="spellStart"/>
-      <w:r>
-        <w:t>signedness</w:t>
-      </w:r>
-      <w:proofErr w:type="spellEnd"/>
-      <w:r>
-        <w:t xml:space="preserve"> must be verified)</w:t>
+        <w:t>HP value (numeric width and signedness must be verified)</w:t>
       </w:r>
     </w:p>
     <w:p>
@@ -4376,15 +3379,7 @@
         <w:t>Multi-character corroboration.</w:t>
       </w:r>
       <w:r>
-        <w:t xml:space="preserve"> Multiple characters with known HP baselines — each one's </w:t>
-      </w:r>
-      <w:proofErr w:type="spellStart"/>
-      <w:r>
-        <w:t>HpUpdate</w:t>
-      </w:r>
-      <w:proofErr w:type="spellEnd"/>
-      <w:r>
-        <w:t xml:space="preserve"> carries that character's HP. Cross-character agreement on field offset confirms identification.</w:t>
+        <w:t xml:space="preserve"> Multiple characters with known HP baselines — each one's HpUpdate carries that character's HP. Cross-character agreement on field offset confirms identification.</w:t>
       </w:r>
     </w:p>
     <w:p>
@@ -4472,13 +3467,8 @@
           <w:numId w:val="27"/>
         </w:numPr>
       </w:pPr>
-      <w:proofErr w:type="gramStart"/>
-      <w:r>
-        <w:t>Repeat</w:t>
-      </w:r>
-      <w:proofErr w:type="gramEnd"/>
-      <w:r>
-        <w:t xml:space="preserve"> with a second known change to confirm field position is consistent.</w:t>
+      <w:r>
+        <w:t>Repeat with a second known change to confirm field position is consistent.</w:t>
       </w:r>
     </w:p>
     <w:p>
@@ -4508,34 +3498,10 @@
           <w:b/>
           <w:bCs/>
         </w:rPr>
-        <w:t xml:space="preserve">HP value width and </w:t>
-      </w:r>
-      <w:proofErr w:type="spellStart"/>
-      <w:r>
-        <w:rPr>
-          <w:b/>
-          <w:bCs/>
-        </w:rPr>
-        <w:t>signedness</w:t>
-      </w:r>
-      <w:proofErr w:type="spellEnd"/>
-      <w:r>
-        <w:rPr>
-          <w:b/>
-          <w:bCs/>
-        </w:rPr>
-        <w:t>.</w:t>
-      </w:r>
-      <w:r>
-        <w:t xml:space="preserve"> </w:t>
-      </w:r>
-      <w:proofErr w:type="gramStart"/>
-      <w:r>
-        <w:t>Must be verified each patch</w:t>
-      </w:r>
-      <w:proofErr w:type="gramEnd"/>
-      <w:r>
-        <w:t>.</w:t>
+        <w:t>HP value width and signedness.</w:t>
+      </w:r>
+      <w:r>
+        <w:t xml:space="preserve"> Must be verified each patch.</w:t>
       </w:r>
     </w:p>
     <w:p>
@@ -4620,12 +3586,10 @@
       <w:pPr>
         <w:pStyle w:val="Heading1"/>
       </w:pPr>
-      <w:proofErr w:type="spellStart"/>
       <w:r>
         <w:lastRenderedPageBreak/>
         <w:t>OP_ManaUpdate</w:t>
       </w:r>
-      <w:proofErr w:type="spellEnd"/>
     </w:p>
     <w:p>
       <w:pPr>
@@ -4637,23 +3601,7 @@
     </w:p>
     <w:p>
       <w:r>
-        <w:t xml:space="preserve">Notification of a </w:t>
-      </w:r>
-      <w:proofErr w:type="spellStart"/>
-      <w:r>
-        <w:t>mana</w:t>
-      </w:r>
-      <w:proofErr w:type="spellEnd"/>
-      <w:r>
-        <w:t xml:space="preserve"> change for the operator's own character. </w:t>
-      </w:r>
-      <w:proofErr w:type="gramStart"/>
-      <w:r>
-        <w:t>Sent</w:t>
-      </w:r>
-      <w:proofErr w:type="gramEnd"/>
-      <w:r>
-        <w:t xml:space="preserve"> by the zone server when the character's mana changes. Carries the new mana value.</w:t>
+        <w:t>Notification of a mana change for the operator's own character. Sent by the zone server when the character's mana changes. Carries the new mana value.</w:t>
       </w:r>
     </w:p>
     <w:p>
@@ -4665,32 +3613,15 @@
       </w:r>
     </w:p>
     <w:p>
-      <w:proofErr w:type="spellStart"/>
-      <w:r>
-        <w:rPr>
-          <w:b/>
-          <w:bCs/>
-        </w:rPr>
-        <w:t>Triggerability</w:t>
-      </w:r>
-      <w:proofErr w:type="spellEnd"/>
-      <w:r>
-        <w:rPr>
-          <w:b/>
-          <w:bCs/>
-        </w:rPr>
-        <w:t xml:space="preserve"> is value-based, not event-based.</w:t>
-      </w:r>
-      <w:r>
-        <w:t xml:space="preserve"> Same as </w:t>
-      </w:r>
-      <w:proofErr w:type="spellStart"/>
-      <w:r>
-        <w:t>HpUpdate</w:t>
-      </w:r>
-      <w:proofErr w:type="spellEnd"/>
-      <w:r>
-        <w:t>.</w:t>
+      <w:r>
+        <w:rPr>
+          <w:b/>
+          <w:bCs/>
+        </w:rPr>
+        <w:t>Triggerability is value-based, not event-based.</w:t>
+      </w:r>
+      <w:r>
+        <w:t xml:space="preserve"> Same as HpUpdate.</w:t>
       </w:r>
     </w:p>
     <w:p>
@@ -4741,15 +3672,7 @@
         <w:t>Context.</w:t>
       </w:r>
       <w:r>
-        <w:t xml:space="preserve"> </w:t>
-      </w:r>
-      <w:proofErr w:type="gramStart"/>
-      <w:r>
-        <w:t>Fires</w:t>
-      </w:r>
-      <w:proofErr w:type="gramEnd"/>
-      <w:r>
-        <w:t xml:space="preserve"> whenever the server wants to update the client on mana. No specific event context.</w:t>
+        <w:t xml:space="preserve"> Fires whenever the server wants to update the client on mana. No specific event context.</w:t>
       </w:r>
     </w:p>
     <w:p>
@@ -4778,15 +3701,7 @@
         </w:numPr>
       </w:pPr>
       <w:r>
-        <w:t xml:space="preserve">Mana value (numeric width and </w:t>
-      </w:r>
-      <w:proofErr w:type="spellStart"/>
-      <w:r>
-        <w:t>signedness</w:t>
-      </w:r>
-      <w:proofErr w:type="spellEnd"/>
-      <w:r>
-        <w:t xml:space="preserve"> must be verified)</w:t>
+        <w:t>Mana value (numeric width and signedness must be verified)</w:t>
       </w:r>
     </w:p>
     <w:p>
@@ -4820,15 +3735,7 @@
         <w:t>Verification technique: changes from a known baseline.</w:t>
       </w:r>
       <w:r>
-        <w:t xml:space="preserve"> Same as </w:t>
-      </w:r>
-      <w:proofErr w:type="spellStart"/>
-      <w:r>
-        <w:t>HpUpdate</w:t>
-      </w:r>
-      <w:proofErr w:type="spellEnd"/>
-      <w:r>
-        <w:t>. Note baseline mana, cast a spell of known cost, search for a numeric field that decreased by approximately that cost.</w:t>
+        <w:t xml:space="preserve"> Same as HpUpdate. Note baseline mana, cast a spell of known cost, search for a numeric field that decreased by approximately that cost.</w:t>
       </w:r>
     </w:p>
     <w:p>
@@ -4995,34 +3902,10 @@
           <w:b/>
           <w:bCs/>
         </w:rPr>
-        <w:t xml:space="preserve">Mana value width and </w:t>
-      </w:r>
-      <w:proofErr w:type="spellStart"/>
-      <w:r>
-        <w:rPr>
-          <w:b/>
-          <w:bCs/>
-        </w:rPr>
-        <w:t>signedness</w:t>
-      </w:r>
-      <w:proofErr w:type="spellEnd"/>
-      <w:r>
-        <w:rPr>
-          <w:b/>
-          <w:bCs/>
-        </w:rPr>
-        <w:t>.</w:t>
-      </w:r>
-      <w:r>
-        <w:t xml:space="preserve"> </w:t>
-      </w:r>
-      <w:proofErr w:type="gramStart"/>
-      <w:r>
-        <w:t>Must be verified each patch</w:t>
-      </w:r>
-      <w:proofErr w:type="gramEnd"/>
-      <w:r>
-        <w:t>.</w:t>
+        <w:t>Mana value width and signedness.</w:t>
+      </w:r>
+      <w:r>
+        <w:t xml:space="preserve"> Must be verified each patch.</w:t>
       </w:r>
     </w:p>
     <w:p>
@@ -5077,21 +3960,8 @@
       </w:r>
     </w:p>
     <w:p>
-      <w:proofErr w:type="spellStart"/>
-      <w:r>
-        <w:t>HpUpdate</w:t>
-      </w:r>
-      <w:proofErr w:type="spellEnd"/>
-      <w:r>
-        <w:t xml:space="preserve"> and </w:t>
-      </w:r>
-      <w:proofErr w:type="spellStart"/>
-      <w:r>
-        <w:t>ManaUpdate</w:t>
-      </w:r>
-      <w:proofErr w:type="spellEnd"/>
-      <w:r>
-        <w:t xml:space="preserve"> are structurally similar — both small inbound packets carrying a single numeric value. Disambiguation:</w:t>
+      <w:r>
+        <w:t>HpUpdate and ManaUpdate are structurally similar — both small inbound packets carrying a single numeric value. Disambiguation:</w:t>
       </w:r>
     </w:p>
     <w:p>
@@ -5102,15 +3972,7 @@
         </w:numPr>
       </w:pPr>
       <w:r>
-        <w:t xml:space="preserve">Cause an HP change without mana change (take damage without casting). The opcode that fires is </w:t>
-      </w:r>
-      <w:proofErr w:type="spellStart"/>
-      <w:r>
-        <w:t>HpUpdate</w:t>
-      </w:r>
-      <w:proofErr w:type="spellEnd"/>
-      <w:r>
-        <w:t>.</w:t>
+        <w:t>Cause an HP change without mana change (take damage without casting). The opcode that fires is HpUpdate.</w:t>
       </w:r>
     </w:p>
     <w:p>
@@ -5121,23 +3983,7 @@
         </w:numPr>
       </w:pPr>
       <w:r>
-        <w:t xml:space="preserve">Cause a </w:t>
-      </w:r>
-      <w:proofErr w:type="spellStart"/>
-      <w:r>
-        <w:t>mana</w:t>
-      </w:r>
-      <w:proofErr w:type="spellEnd"/>
-      <w:r>
-        <w:t xml:space="preserve"> change without HP change (cast a spell without taking damage). The opcode that fires is </w:t>
-      </w:r>
-      <w:proofErr w:type="spellStart"/>
-      <w:r>
-        <w:t>ManaUpdate</w:t>
-      </w:r>
-      <w:proofErr w:type="spellEnd"/>
-      <w:r>
-        <w:t>.</w:t>
+        <w:t>Cause a mana change without HP change (cast a spell without taking damage). The opcode that fires is ManaUpdate.</w:t>
       </w:r>
     </w:p>
     <w:p>
@@ -5197,12 +4043,10 @@
       <w:pPr>
         <w:pStyle w:val="Heading1"/>
       </w:pPr>
-      <w:proofErr w:type="spellStart"/>
       <w:r>
         <w:lastRenderedPageBreak/>
         <w:t>OP_Tracking</w:t>
       </w:r>
-      <w:proofErr w:type="spellEnd"/>
     </w:p>
     <w:p>
       <w:pPr>
@@ -5219,15 +4063,7 @@
     </w:p>
     <w:p>
       <w:r>
-        <w:t xml:space="preserve">Response to a ranger or druid tracking skill activation. </w:t>
-      </w:r>
-      <w:proofErr w:type="gramStart"/>
-      <w:r>
-        <w:t>Sent</w:t>
-      </w:r>
-      <w:proofErr w:type="gramEnd"/>
-      <w:r>
-        <w:t xml:space="preserve"> by the zone server when the operator's character uses Track. Carries an array of trackable spawns currently in the zone.</w:t>
+        <w:t>Response to a ranger or druid tracking skill activation. Sent by the zone server when the operator's character uses Track. Carries an array of trackable spawns currently in the zone.</w:t>
       </w:r>
     </w:p>
     <w:p>
@@ -5244,33 +4080,13 @@
           <w:b/>
           <w:bCs/>
         </w:rPr>
-        <w:t>Content</w:t>
-      </w:r>
-      <w:proofErr w:type="gramStart"/>
-      <w:r>
-        <w:rPr>
-          <w:b/>
-          <w:bCs/>
-        </w:rPr>
-        <w:t xml:space="preserve">:  </w:t>
-      </w:r>
-      <w:r>
-        <w:t>V0</w:t>
-      </w:r>
-      <w:proofErr w:type="gramEnd"/>
-      <w:r>
-        <w:t xml:space="preserve"> has no context.  V1 has a “magic number” at a known offset.  Otherwise V2.  V2 is the only one of interest, and it has an array of structures</w:t>
-      </w:r>
-      <w:r>
-        <w:t xml:space="preserve"> prefixed by a count.  Each entry has a </w:t>
-      </w:r>
-      <w:proofErr w:type="spellStart"/>
-      <w:r>
-        <w:t>spawn_id</w:t>
-      </w:r>
-      <w:proofErr w:type="spellEnd"/>
-      <w:r>
-        <w:t>, a level, and a null-terminated string with a mob name.  Strings should never be null.</w:t>
+        <w:t xml:space="preserve">Content:  </w:t>
+      </w:r>
+      <w:r>
+        <w:t>V0 has no context.  V1 has a “magic number” at a known offset.  Otherwise V2.  V2 is the only one of interest, and it has an array of structures</w:t>
+      </w:r>
+      <w:r>
+        <w:t xml:space="preserve"> prefixed by a count.  Each entry has a spawn_id, a level, and a null-terminated string with a mob name.  Strings should never be null.</w:t>
       </w:r>
     </w:p>
     <w:p>
@@ -5297,15 +4113,7 @@
         <w:t>Frequency.</w:t>
       </w:r>
       <w:r>
-        <w:t xml:space="preserve"> Sporadic, </w:t>
-      </w:r>
-      <w:proofErr w:type="gramStart"/>
-      <w:r>
-        <w:t>operator-controlled</w:t>
-      </w:r>
-      <w:proofErr w:type="gramEnd"/>
-      <w:r>
-        <w:t>.</w:t>
+        <w:t xml:space="preserve"> Sporadic, operator-controlled.</w:t>
       </w:r>
     </w:p>
     <w:p>
@@ -5395,15 +4203,7 @@
         <w:t>Verification technique.</w:t>
       </w:r>
       <w:r>
-        <w:t xml:space="preserve"> Search the candidate packet for any known mob name — a named NPC known to live in this zone, a name from recent </w:t>
-      </w:r>
-      <w:proofErr w:type="spellStart"/>
-      <w:r>
-        <w:t>ZoneEntry</w:t>
-      </w:r>
-      <w:proofErr w:type="spellEnd"/>
-      <w:r>
-        <w:t xml:space="preserve"> traffic, or a name from local fauna. One ASCII match in a packet of the right size, following a tracking activation, confirms the opcode.</w:t>
+        <w:t xml:space="preserve"> Search the candidate packet for any known mob name — a named NPC known to live in this zone, a name from recent ZoneEntry traffic, or a name from local fauna. One ASCII match in a packet of the right size, following a tracking activation, confirms the opcode.</w:t>
       </w:r>
     </w:p>
     <w:p>
@@ -5530,15 +4330,7 @@
         </w:numPr>
       </w:pPr>
       <w:r>
-        <w:t xml:space="preserve">With element boundaries identified, examine per-element bytes. Cross-reference candidate spawn IDs against recent </w:t>
-      </w:r>
-      <w:proofErr w:type="spellStart"/>
-      <w:r>
-        <w:t>ZoneEntry</w:t>
-      </w:r>
-      <w:proofErr w:type="spellEnd"/>
-      <w:r>
-        <w:t xml:space="preserve"> data.</w:t>
+        <w:t>With element boundaries identified, examine per-element bytes. Cross-reference candidate spawn IDs against recent ZoneEntry data.</w:t>
       </w:r>
     </w:p>
     <w:p>
@@ -5664,23 +4456,7 @@
         <w:t>Verification:</w:t>
       </w:r>
       <w:r>
-        <w:t xml:space="preserve"> Benefits from </w:t>
-      </w:r>
-      <w:proofErr w:type="spellStart"/>
-      <w:r>
-        <w:t>OP_ZoneEntry</w:t>
-      </w:r>
-      <w:proofErr w:type="spellEnd"/>
-      <w:r>
-        <w:t xml:space="preserve"> (spawn ID cross-reference) and </w:t>
-      </w:r>
-      <w:proofErr w:type="spellStart"/>
-      <w:r>
-        <w:t>OP_FormattedMessage</w:t>
-      </w:r>
-      <w:proofErr w:type="spellEnd"/>
-      <w:r>
-        <w:t xml:space="preserve"> (name corroboration through tracking-output messages).</w:t>
+        <w:t xml:space="preserve"> Benefits from OP_ZoneEntry (spawn ID cross-reference) and OP_FormattedMessage (name corroboration through tracking-output messages).</w:t>
       </w:r>
     </w:p>
     <w:p>
@@ -5710,12 +4486,10 @@
       <w:pPr>
         <w:pStyle w:val="Heading1"/>
       </w:pPr>
-      <w:proofErr w:type="spellStart"/>
       <w:r>
         <w:lastRenderedPageBreak/>
         <w:t>OP_ClientUpdate</w:t>
       </w:r>
-      <w:proofErr w:type="spellEnd"/>
     </w:p>
     <w:p>
       <w:pPr>
@@ -5727,15 +4501,7 @@
     </w:p>
     <w:p>
       <w:r>
-        <w:t xml:space="preserve">Outbound position update from the client to the zone server. The operator's own character reports its position, heading, and movement state. The client-side counterpart to </w:t>
-      </w:r>
-      <w:proofErr w:type="spellStart"/>
-      <w:r>
-        <w:t>OP_NpcMoveUpdate</w:t>
-      </w:r>
-      <w:proofErr w:type="spellEnd"/>
-      <w:r>
-        <w:t>. Sent on a regular cadence while in the zone.</w:t>
+        <w:t>Outbound position update from the client to the zone server. The operator's own character reports its position, heading, and movement state. The client-side counterpart to OP_NpcMoveUpdate. Sent on a regular cadence while in the zone.</w:t>
       </w:r>
     </w:p>
     <w:p>
@@ -5770,26 +4536,10 @@
         <w:t>Frequency.</w:t>
       </w:r>
       <w:r>
-        <w:t xml:space="preserve"> Steady cadence while in the zone. Even standing still, the client likely sends periodic </w:t>
-      </w:r>
-      <w:proofErr w:type="spellStart"/>
-      <w:r>
-        <w:t>ClientUpdate</w:t>
-      </w:r>
-      <w:proofErr w:type="spellEnd"/>
-      <w:r>
-        <w:t xml:space="preserve"> packets.</w:t>
-      </w:r>
-      <w:r>
-        <w:t xml:space="preserve">  This is a </w:t>
-      </w:r>
-      <w:proofErr w:type="gramStart"/>
-      <w:r>
-        <w:t>fairly high</w:t>
-      </w:r>
-      <w:proofErr w:type="gramEnd"/>
-      <w:r>
-        <w:t xml:space="preserve"> frequency packet.</w:t>
+        <w:t xml:space="preserve"> Steady cadence while in the zone. Even standing still, the client likely sends periodic ClientUpdate packets.</w:t>
+      </w:r>
+      <w:r>
+        <w:t xml:space="preserve">  This is a fairly high frequency packet.</w:t>
       </w:r>
     </w:p>
     <w:p>
@@ -5959,15 +4709,7 @@
         <w:t>Static position anchor.</w:t>
       </w:r>
       <w:r>
-        <w:t xml:space="preserve"> Stand at a known position. Capture several </w:t>
-      </w:r>
-      <w:proofErr w:type="spellStart"/>
-      <w:r>
-        <w:t>ClientUpdate</w:t>
-      </w:r>
-      <w:proofErr w:type="spellEnd"/>
-      <w:r>
-        <w:t xml:space="preserve"> packets. Search for numeric values matching x, y, z. Fields should be at consistent offsets. Stand at a different position; same offsets should now hold the new values.</w:t>
+        <w:t xml:space="preserve"> Stand at a known position. Capture several ClientUpdate packets. Search for numeric values matching x, y, z. Fields should be at consistent offsets. Stand at a different position; same offsets should now hold the new values.</w:t>
       </w:r>
     </w:p>
     <w:p>
@@ -6056,15 +4798,7 @@
         </w:numPr>
       </w:pPr>
       <w:r>
-        <w:t xml:space="preserve">Capture several </w:t>
-      </w:r>
-      <w:proofErr w:type="spellStart"/>
-      <w:r>
-        <w:t>ClientUpdate</w:t>
-      </w:r>
-      <w:proofErr w:type="spellEnd"/>
-      <w:r>
-        <w:t xml:space="preserve"> candidates while standing still.</w:t>
+        <w:t>Capture several ClientUpdate candidates while standing still.</w:t>
       </w:r>
     </w:p>
     <w:p>
@@ -6259,12 +4993,10 @@
       <w:pPr>
         <w:pStyle w:val="Heading1"/>
       </w:pPr>
-      <w:proofErr w:type="spellStart"/>
       <w:r>
         <w:lastRenderedPageBreak/>
         <w:t>OP_SetChatServer</w:t>
       </w:r>
-      <w:proofErr w:type="spellEnd"/>
     </w:p>
     <w:p>
       <w:pPr>
@@ -6296,15 +5028,7 @@
         <w:t>Distinctive content.</w:t>
       </w:r>
       <w:r>
-        <w:t xml:space="preserve"> The payload contains an IP address or hostname and port number for the chat server. This is one of the few opcodes whose content is essentially unique — searching captured packets for a known chat server address narrows </w:t>
-      </w:r>
-      <w:proofErr w:type="gramStart"/>
-      <w:r>
-        <w:t>candidates</w:t>
-      </w:r>
-      <w:proofErr w:type="gramEnd"/>
-      <w:r>
-        <w:t xml:space="preserve"> immediately.</w:t>
+        <w:t xml:space="preserve"> The payload contains an IP address or hostname and port number for the chat server. This is one of the few opcodes whose content is essentially unique — searching captured packets for a known chat server address narrows candidates immediately.</w:t>
       </w:r>
     </w:p>
     <w:p>
@@ -6418,15 +5142,7 @@
         <w:t>Verification technique.</w:t>
       </w:r>
       <w:r>
-        <w:t xml:space="preserve"> The chat server address is observable from network captures independently — any chat-related traffic from the client will reveal where the client is sending it. That observed address can be searched for in candidate packets. A small inbound packet containing the chat server's hostname or IP in ASCII or stringified numeric form is the </w:t>
-      </w:r>
-      <w:proofErr w:type="spellStart"/>
-      <w:r>
-        <w:t>SetChatServer</w:t>
-      </w:r>
-      <w:proofErr w:type="spellEnd"/>
-      <w:r>
-        <w:t xml:space="preserve"> candidate.</w:t>
+        <w:t xml:space="preserve"> The chat server address is observable from network captures independently — any chat-related traffic from the client will reveal where the client is sending it. That observed address can be searched for in candidate packets. A small inbound packet containing the chat server's hostname or IP in ASCII or stringified numeric form is the SetChatServer candidate.</w:t>
       </w:r>
     </w:p>
     <w:p>
@@ -6509,15 +5225,7 @@
         </w:numPr>
       </w:pPr>
       <w:r>
-        <w:t xml:space="preserve">The matching packet is the </w:t>
-      </w:r>
-      <w:proofErr w:type="spellStart"/>
-      <w:r>
-        <w:t>SetChatServer</w:t>
-      </w:r>
-      <w:proofErr w:type="spellEnd"/>
-      <w:r>
-        <w:t xml:space="preserve"> candidate.</w:t>
+        <w:t>The matching packet is the SetChatServer candidate.</w:t>
       </w:r>
     </w:p>
     <w:p>
@@ -6594,23 +5302,7 @@
           <w:b/>
           <w:bCs/>
         </w:rPr>
-        <w:t xml:space="preserve">Authentication </w:t>
-      </w:r>
-      <w:proofErr w:type="gramStart"/>
-      <w:r>
-        <w:rPr>
-          <w:b/>
-          <w:bCs/>
-        </w:rPr>
-        <w:t>token</w:t>
-      </w:r>
-      <w:proofErr w:type="gramEnd"/>
-      <w:r>
-        <w:rPr>
-          <w:b/>
-          <w:bCs/>
-        </w:rPr>
-        <w:t xml:space="preserve"> presence.</w:t>
+        <w:t>Authentication token presence.</w:t>
       </w:r>
       <w:r>
         <w:t xml:space="preserve"> May or may not be in the payload.</w:t>
@@ -6684,15 +5376,7 @@
     </w:p>
     <w:p>
       <w:r>
-        <w:t xml:space="preserve">Movement-history-related traffic — exact role uncertain. The handler is unusually large (29 KB of source) and likely accumulates significant logging or analysis logic. Further investigation </w:t>
-      </w:r>
-      <w:proofErr w:type="gramStart"/>
-      <w:r>
-        <w:t>needed</w:t>
-      </w:r>
-      <w:proofErr w:type="gramEnd"/>
-      <w:r>
-        <w:t xml:space="preserve"> to characterize the opcode's purpose precisely.</w:t>
+        <w:t>Movement-history-related traffic — exact role uncertain. The handler is unusually large (29 KB of source) and likely accumulates significant logging or analysis logic. Further investigation needed to characterize the opcode's purpose precisely.</w:t>
       </w:r>
     </w:p>
     <w:p>
@@ -6715,7 +5399,10 @@
         <w:t xml:space="preserve"> </w:t>
       </w:r>
       <w:r>
-        <w:t xml:space="preserve"> None.</w:t>
+        <w:t xml:space="preserve"> </w:t>
+      </w:r>
+      <w:r>
+        <w:t>None.</w:t>
       </w:r>
     </w:p>
     <w:p>
@@ -6742,15 +5429,7 @@
         <w:t xml:space="preserve"> </w:t>
       </w:r>
       <w:r>
-        <w:t xml:space="preserve">Always an array of fixed length structures with a possible trailer.  Currently seen as 17N+1 </w:t>
-      </w:r>
-      <w:proofErr w:type="gramStart"/>
-      <w:r>
-        <w:t>bytes</w:t>
-      </w:r>
-      <w:proofErr w:type="gramEnd"/>
-      <w:r>
-        <w:t xml:space="preserve"> in length.</w:t>
+        <w:t>Always an array of fixed length structures with a possible trailer.  Currently seen as 17N+1 bytes in length.</w:t>
       </w:r>
     </w:p>
     <w:p>
@@ -6848,15 +5527,7 @@
     </w:p>
     <w:p>
       <w:r>
-        <w:t>Before patch-day operations, characterize this opcode separately. Review Glass/Network/Handlers/</w:t>
-      </w:r>
-      <w:proofErr w:type="spellStart"/>
-      <w:r>
-        <w:t>HandleMovementHistory.cs</w:t>
-      </w:r>
-      <w:proofErr w:type="spellEnd"/>
-      <w:r>
-        <w:t xml:space="preserve"> to understand what fields are currently extracted and what the handler does with them. Without that characterization, patch-day re-identification of this opcode should be deferred — the handler can be left non-functional through the patch transition without breaking the rest of Glass, since other handlers do not appear to depend on its output.</w:t>
+        <w:t>Before patch-day operations, characterize this opcode separately. Review Glass/Network/Handlers/HandleMovementHistory.cs to understand what fields are currently extracted and what the handler does with them. Without that characterization, patch-day re-identification of this opcode should be deferred — the handler can be left non-functional through the patch transition without breaking the rest of Glass, since other handlers do not appear to depend on its output.</w:t>
       </w:r>
     </w:p>
     <w:p>
@@ -6971,23 +5642,7 @@
         </w:numPr>
       </w:pPr>
       <w:r>
-        <w:t xml:space="preserve">All characters used in patch-day work have recent zone-in entries (so </w:t>
-      </w:r>
-      <w:proofErr w:type="spellStart"/>
-      <w:r>
-        <w:t>PlayerProfile</w:t>
-      </w:r>
-      <w:proofErr w:type="spellEnd"/>
-      <w:r>
-        <w:t xml:space="preserve"> / </w:t>
-      </w:r>
-      <w:proofErr w:type="spellStart"/>
-      <w:r>
-        <w:t>ZoneEntry</w:t>
-      </w:r>
-      <w:proofErr w:type="spellEnd"/>
-      <w:r>
-        <w:t xml:space="preserve"> verification has fresh anchors)</w:t>
+        <w:t>All characters used in patch-day work have recent zone-in entries (so PlayerProfile / ZoneEntry verification has fresh anchors)</w:t>
       </w:r>
     </w:p>
     <w:p>
@@ -6998,13 +5653,8 @@
         </w:numPr>
       </w:pPr>
       <w:r>
-        <w:t xml:space="preserve">Prior-patch field definitions are stored in the Inference database — these are the verification </w:t>
-      </w:r>
-      <w:proofErr w:type="gramStart"/>
-      <w:r>
-        <w:t>reference</w:t>
-      </w:r>
-      <w:proofErr w:type="gramEnd"/>
+        <w:t>Prior-patch field definitions are stored in the Inference database — these are the verification reference</w:t>
+      </w:r>
     </w:p>
     <w:p>
       <w:pPr>
@@ -7014,15 +5664,7 @@
         </w:numPr>
       </w:pPr>
       <w:r>
-        <w:t>Decompiled signatures for key handler functions from eqgame.exe are archived (</w:t>
-      </w:r>
-      <w:proofErr w:type="spellStart"/>
-      <w:r>
-        <w:t>Ghidra</w:t>
-      </w:r>
-      <w:proofErr w:type="spellEnd"/>
-      <w:r>
-        <w:t>)</w:t>
+        <w:t>Decompiled signatures for key handler functions from eqgame.exe are archived (Ghidra)</w:t>
       </w:r>
     </w:p>
     <w:p>
@@ -7064,23 +5706,7 @@
         </w:numPr>
       </w:pPr>
       <w:r>
-        <w:t xml:space="preserve">Login and zone into a populated zone with all six characters — captures </w:t>
-      </w:r>
-      <w:proofErr w:type="spellStart"/>
-      <w:r>
-        <w:t>PlayerProfile</w:t>
-      </w:r>
-      <w:proofErr w:type="spellEnd"/>
-      <w:r>
-        <w:t xml:space="preserve"> and the </w:t>
-      </w:r>
-      <w:proofErr w:type="spellStart"/>
-      <w:r>
-        <w:t>ZoneEntry</w:t>
-      </w:r>
-      <w:proofErr w:type="spellEnd"/>
-      <w:r>
-        <w:t xml:space="preserve"> burst</w:t>
+        <w:t>Login and zone into a populated zone with all six characters — captures PlayerProfile and the ZoneEntry burst</w:t>
       </w:r>
     </w:p>
     <w:p>
@@ -7091,31 +5717,7 @@
         </w:numPr>
       </w:pPr>
       <w:r>
-        <w:t xml:space="preserve">Stand still for 30 seconds — establishes </w:t>
-      </w:r>
-      <w:proofErr w:type="spellStart"/>
-      <w:r>
-        <w:t>ClientUpdate</w:t>
-      </w:r>
-      <w:proofErr w:type="spellEnd"/>
-      <w:r>
-        <w:t xml:space="preserve"> baseline and a sample of </w:t>
-      </w:r>
-      <w:proofErr w:type="spellStart"/>
-      <w:r>
-        <w:t>NpcMoveUpdate</w:t>
-      </w:r>
-      <w:proofErr w:type="spellEnd"/>
-      <w:r>
-        <w:t xml:space="preserve"> and </w:t>
-      </w:r>
-      <w:proofErr w:type="spellStart"/>
-      <w:r>
-        <w:t>MobUpdate</w:t>
-      </w:r>
-      <w:proofErr w:type="spellEnd"/>
-      <w:r>
-        <w:t xml:space="preserve"> for mobs in the area</w:t>
+        <w:t>Stand still for 30 seconds — establishes ClientUpdate baseline and a sample of NpcMoveUpdate and MobUpdate for mobs in the area</w:t>
       </w:r>
     </w:p>
     <w:p>
@@ -7126,15 +5728,7 @@
         </w:numPr>
       </w:pPr>
       <w:r>
-        <w:t xml:space="preserve">Walk a known straight-line path north — provides movement diff data for </w:t>
-      </w:r>
-      <w:proofErr w:type="spellStart"/>
-      <w:r>
-        <w:t>ClientUpdate</w:t>
-      </w:r>
-      <w:proofErr w:type="spellEnd"/>
-      <w:r>
-        <w:t xml:space="preserve"> coordinate fields</w:t>
+        <w:t>Walk a known straight-line path north — provides movement diff data for ClientUpdate coordinate fields</w:t>
       </w:r>
     </w:p>
     <w:p>
@@ -7146,13 +5740,8 @@
       </w:pPr>
       <w:r>
         <w:lastRenderedPageBreak/>
-        <w:t xml:space="preserve">Face each cardinal direction in sequence — provides heading anchor for </w:t>
-      </w:r>
-      <w:proofErr w:type="spellStart"/>
-      <w:r>
-        <w:t>ClientUpdate</w:t>
-      </w:r>
-      <w:proofErr w:type="spellEnd"/>
+        <w:t>Face each cardinal direction in sequence — provides heading anchor for ClientUpdate</w:t>
+      </w:r>
     </w:p>
     <w:p>
       <w:pPr>
@@ -7162,15 +5751,7 @@
         </w:numPr>
       </w:pPr>
       <w:r>
-        <w:t xml:space="preserve">Activate Track on a ranger or druid — captures Tracking and </w:t>
-      </w:r>
-      <w:proofErr w:type="spellStart"/>
-      <w:r>
-        <w:t>FormattedMessage</w:t>
-      </w:r>
-      <w:proofErr w:type="spellEnd"/>
-      <w:r>
-        <w:t xml:space="preserve"> with known mob names</w:t>
+        <w:t>Activate Track on a ranger or druid — captures Tracking and FormattedMessage with known mob names</w:t>
       </w:r>
     </w:p>
     <w:p>
@@ -7192,31 +5773,7 @@
         </w:numPr>
       </w:pPr>
       <w:r>
-        <w:t>Send chat on multiple channels (/say, /</w:t>
-      </w:r>
-      <w:proofErr w:type="spellStart"/>
-      <w:r>
-        <w:t>ooc</w:t>
-      </w:r>
-      <w:proofErr w:type="spellEnd"/>
-      <w:r>
-        <w:t>, /shout, /</w:t>
-      </w:r>
-      <w:proofErr w:type="gramStart"/>
-      <w:r>
-        <w:t>tell) —</w:t>
-      </w:r>
-      <w:proofErr w:type="gramEnd"/>
-      <w:r>
-        <w:t xml:space="preserve"> captures </w:t>
-      </w:r>
-      <w:proofErr w:type="spellStart"/>
-      <w:r>
-        <w:t>CommonMessage</w:t>
-      </w:r>
-      <w:proofErr w:type="spellEnd"/>
-      <w:r>
-        <w:t xml:space="preserve"> with channel discriminator</w:t>
+        <w:t>Send chat on multiple channels (/say, /ooc, /shout, /tell) — captures CommonMessage with channel discriminator</w:t>
       </w:r>
     </w:p>
     <w:p>
@@ -7227,15 +5784,7 @@
         </w:numPr>
       </w:pPr>
       <w:r>
-        <w:t xml:space="preserve">Cast a known-cost spell on a caster character — captures </w:t>
-      </w:r>
-      <w:proofErr w:type="spellStart"/>
-      <w:r>
-        <w:t>ManaUpdate</w:t>
-      </w:r>
-      <w:proofErr w:type="spellEnd"/>
-      <w:r>
-        <w:t xml:space="preserve"> with known delta</w:t>
+        <w:t>Cast a known-cost spell on a caster character — captures ManaUpdate with known delta</w:t>
       </w:r>
     </w:p>
     <w:p>
@@ -7246,15 +5795,7 @@
         </w:numPr>
       </w:pPr>
       <w:r>
-        <w:t xml:space="preserve">Take damage from a known mob — captures </w:t>
-      </w:r>
-      <w:proofErr w:type="spellStart"/>
-      <w:r>
-        <w:t>HpUpdate</w:t>
-      </w:r>
-      <w:proofErr w:type="spellEnd"/>
-      <w:r>
-        <w:t xml:space="preserve"> with known delta</w:t>
+        <w:t>Take damage from a known mob — captures HpUpdate with known delta</w:t>
       </w:r>
     </w:p>
     <w:p>

</xml_diff>